<commit_message>
Refresh NBU delivery documents and presentation
</commit_message>
<xml_diff>
--- a/entregables/Documentacion-Tecnica-NBU.docx
+++ b/entregables/Documentacion-Tecnica-NBU.docx
@@ -4,30 +4,88 @@
   <w:body>
     <w:p>
       <w:pPr>
-        <w:pStyle w:val="Title"/>
-        <w:keepNext/>
+        <w:spacing w:before="40" w:after="60"/>
+        <w:jc w:val="center"/>
+      </w:pPr>
+      <w:r>
+        <w:drawing>
+          <wp:inline xmlns:a="http://schemas.openxmlformats.org/drawingml/2006/main" xmlns:pic="http://schemas.openxmlformats.org/drawingml/2006/picture">
+            <wp:extent cx="676656" cy="676656"/>
+            <wp:docPr id="1" name="Picture 1"/>
+            <wp:cNvGraphicFramePr>
+              <a:graphicFrameLocks noChangeAspect="1"/>
+            </wp:cNvGraphicFramePr>
+            <a:graphic>
+              <a:graphicData uri="http://schemas.openxmlformats.org/drawingml/2006/picture">
+                <pic:pic>
+                  <pic:nvPicPr>
+                    <pic:cNvPr id="0" name="nbu-mark.png"/>
+                    <pic:cNvPicPr/>
+                  </pic:nvPicPr>
+                  <pic:blipFill>
+                    <a:blip r:embed="rId11"/>
+                    <a:stretch>
+                      <a:fillRect/>
+                    </a:stretch>
+                  </pic:blipFill>
+                  <pic:spPr>
+                    <a:xfrm>
+                      <a:off x="0" y="0"/>
+                      <a:ext cx="676656" cy="676656"/>
+                    </a:xfrm>
+                    <a:prstGeom prst="rect"/>
+                  </pic:spPr>
+                </pic:pic>
+              </a:graphicData>
+            </a:graphic>
+          </wp:inline>
+        </w:drawing>
+      </w:r>
+    </w:p>
+    <w:p>
+      <w:pPr>
+        <w:spacing w:after="0"/>
+        <w:jc w:val="center"/>
       </w:pPr>
       <w:r>
         <w:rPr>
           <w:rFonts w:ascii="Arial" w:hAnsi="Arial"/>
           <w:b/>
-          <w:color w:val="000000"/>
-          <w:sz w:val="50"/>
+          <w:color w:val="20B6C3"/>
+          <w:sz w:val="17"/>
         </w:rPr>
-        <w:t>Documentación técnica NBU</w:t>
+        <w:t>DOCUMENTACIÓN TÉCNICA</w:t>
       </w:r>
     </w:p>
     <w:p>
       <w:pPr>
-        <w:spacing w:after="200"/>
+        <w:pStyle w:val="Title"/>
+        <w:spacing w:after="60"/>
+        <w:jc w:val="center"/>
       </w:pPr>
       <w:r>
         <w:rPr>
           <w:rFonts w:ascii="Arial" w:hAnsi="Arial"/>
+          <w:b/>
+          <w:color w:val="092754"/>
+          <w:sz w:val="48"/>
+        </w:rPr>
+        <w:t>NBU</w:t>
+      </w:r>
+    </w:p>
+    <w:p>
+      <w:pPr>
+        <w:spacing w:after="160"/>
+        <w:jc w:val="center"/>
+      </w:pPr>
+      <w:r>
+        <w:rPr>
+          <w:rFonts w:ascii="Arial" w:hAnsi="Arial"/>
+          <w:b w:val="0"/>
           <w:color w:val="64758A"/>
-          <w:sz w:val="21"/>
+          <w:sz w:val="19"/>
         </w:rPr>
-        <w:t>Arquitectura, base de datos, seguridad y ejecución del sistema</w:t>
+        <w:t>Cómo está organizado, cómo se conecta y cómo se ejecuta el sistema</w:t>
       </w:r>
     </w:p>
     <w:p>
@@ -45,9 +103,11 @@
       <w:r>
         <w:rPr>
           <w:rFonts w:ascii="Arial" w:hAnsi="Arial"/>
+          <w:b w:val="0"/>
           <w:color w:val="182B43"/>
+          <w:sz w:val="18"/>
         </w:rPr>
-        <w:t>NBU es un sistema académico para administrar becas universitarias y ofrecer a cada estudiante una vista privada de sus solicitudes, depósitos, noticias y notificaciones. La solución tiene dos programas .NET 8 que comparten SQL Server: un sitio ASP.NET Core MVC y una aplicación de escritorio Windows Forms.</w:t>
+        <w:t>NBU reúne la gestión administrativa de becas universitarias con un portal para estudiantes. El estudiante puede solicitar acceso por internet, esperar la revisión del personal y, una vez aprobado, consultar las convocatorias, sus solicitudes, depósitos registrados, noticias y avisos.</w:t>
       </w:r>
     </w:p>
     <w:p>
@@ -57,9 +117,11 @@
       <w:r>
         <w:rPr>
           <w:rFonts w:ascii="Arial" w:hAnsi="Arial"/>
+          <w:b w:val="0"/>
           <w:color w:val="182B43"/>
+          <w:sz w:val="18"/>
         </w:rPr>
-        <w:t>El personal administra cuatro módulos con operaciones CRUD. El estudiante puede consultar convocatorias abiertas, enviar una solicitud y consultar únicamente los registros asociados a su cuenta.</w:t>
+        <w:t>La solución contiene dos programas .NET 8: un sitio web ASP.NET Core MVC y una aplicación de escritorio Windows Forms. Ambos usan el proyecto NBU.Data y la misma base de datos SQL Server.</w:t>
       </w:r>
     </w:p>
     <w:p>
@@ -67,19 +129,20 @@
         <w:pStyle w:val="Heading1"/>
       </w:pPr>
       <w:r>
-        <w:t>2. Arquitectura de la solución</w:t>
+        <w:t>2. Organización de la solución</w:t>
       </w:r>
     </w:p>
     <w:tbl>
       <w:tblPr>
+        <w:tblStyle w:val="TableGrid"/>
         <w:tblW w:type="auto" w:w="0"/>
         <w:jc w:val="center"/>
         <w:tblLayout w:type="fixed"/>
         <w:tblLook w:firstColumn="1" w:firstRow="1" w:lastColumn="0" w:lastRow="0" w:noHBand="0" w:noVBand="1" w:val="04A0"/>
       </w:tblPr>
       <w:tblGrid>
-        <w:gridCol w:w="2376"/>
-        <w:gridCol w:w="8136"/>
+        <w:gridCol w:w="3816"/>
+        <w:gridCol w:w="6077"/>
       </w:tblGrid>
       <w:tr>
         <w:trPr>
@@ -87,19 +150,19 @@
         </w:trPr>
         <w:tc>
           <w:tcPr>
-            <w:tcW w:type="dxa" w:w="2376"/>
+            <w:tcW w:type="dxa" w:w="3816"/>
+            <w:vAlign w:val="center"/>
             <w:shd w:fill="092754"/>
             <w:tcMar>
-              <w:top w:w="95" w:type="dxa"/>
-              <w:start w:w="115" w:type="dxa"/>
-              <w:bottom w:w="95" w:type="dxa"/>
-              <w:end w:w="115" w:type="dxa"/>
+              <w:top w:w="80" w:type="dxa"/>
+              <w:start w:w="100" w:type="dxa"/>
+              <w:bottom w:w="80" w:type="dxa"/>
+              <w:end w:w="100" w:type="dxa"/>
             </w:tcMar>
-            <w:vAlign w:val="center"/>
           </w:tcPr>
           <w:p>
             <w:pPr>
-              <w:spacing w:after="0"/>
+              <w:spacing w:after="0" w:line="245" w:lineRule="auto"/>
             </w:pPr>
             <w:r/>
             <w:r>
@@ -107,27 +170,27 @@
                 <w:rFonts w:ascii="Arial" w:hAnsi="Arial"/>
                 <w:b/>
                 <w:color w:val="FFFFFF"/>
-                <w:sz w:val="17"/>
+                <w:sz w:val="15"/>
               </w:rPr>
-              <w:t>Proyecto</w:t>
+              <w:t>Proyecto/carpeta</w:t>
             </w:r>
           </w:p>
         </w:tc>
         <w:tc>
           <w:tcPr>
-            <w:tcW w:type="dxa" w:w="8136"/>
+            <w:tcW w:type="dxa" w:w="6077"/>
+            <w:vAlign w:val="center"/>
             <w:shd w:fill="092754"/>
             <w:tcMar>
-              <w:top w:w="95" w:type="dxa"/>
-              <w:start w:w="115" w:type="dxa"/>
-              <w:bottom w:w="95" w:type="dxa"/>
-              <w:end w:w="115" w:type="dxa"/>
+              <w:top w:w="80" w:type="dxa"/>
+              <w:start w:w="100" w:type="dxa"/>
+              <w:bottom w:w="80" w:type="dxa"/>
+              <w:end w:w="100" w:type="dxa"/>
             </w:tcMar>
-            <w:vAlign w:val="center"/>
           </w:tcPr>
           <w:p>
             <w:pPr>
-              <w:spacing w:after="0"/>
+              <w:spacing w:after="0" w:line="245" w:lineRule="auto"/>
             </w:pPr>
             <w:r/>
             <w:r>
@@ -135,7 +198,7 @@
                 <w:rFonts w:ascii="Arial" w:hAnsi="Arial"/>
                 <w:b/>
                 <w:color w:val="FFFFFF"/>
-                <w:sz w:val="17"/>
+                <w:sz w:val="15"/>
               </w:rPr>
               <w:t>Responsabilidad</w:t>
             </w:r>
@@ -145,19 +208,19 @@
       <w:tr>
         <w:tc>
           <w:tcPr>
-            <w:tcW w:type="dxa" w:w="2376"/>
+            <w:tcW w:type="dxa" w:w="3816"/>
             <w:vAlign w:val="center"/>
             <w:shd w:fill="EFF5FA"/>
             <w:tcMar>
-              <w:top w:w="95" w:type="dxa"/>
-              <w:start w:w="115" w:type="dxa"/>
-              <w:bottom w:w="95" w:type="dxa"/>
-              <w:end w:w="115" w:type="dxa"/>
+              <w:top w:w="80" w:type="dxa"/>
+              <w:start w:w="100" w:type="dxa"/>
+              <w:bottom w:w="80" w:type="dxa"/>
+              <w:end w:w="100" w:type="dxa"/>
             </w:tcMar>
           </w:tcPr>
           <w:p>
             <w:pPr>
-              <w:spacing w:after="0" w:line="240" w:lineRule="auto"/>
+              <w:spacing w:after="0" w:line="245" w:lineRule="auto"/>
             </w:pPr>
             <w:r/>
             <w:r>
@@ -165,27 +228,27 @@
                 <w:rFonts w:ascii="Arial" w:hAnsi="Arial"/>
                 <w:b/>
                 <w:color w:val="182B43"/>
-                <w:sz w:val="17"/>
+                <w:sz w:val="15"/>
               </w:rPr>
-              <w:t>NBU.Web</w:t>
+              <w:t>NBU.Web/Controllers</w:t>
             </w:r>
           </w:p>
         </w:tc>
         <w:tc>
           <w:tcPr>
-            <w:tcW w:type="dxa" w:w="8136"/>
+            <w:tcW w:type="dxa" w:w="6077"/>
             <w:vAlign w:val="center"/>
             <w:shd w:fill="EFF5FA"/>
             <w:tcMar>
-              <w:top w:w="95" w:type="dxa"/>
-              <w:start w:w="115" w:type="dxa"/>
-              <w:bottom w:w="95" w:type="dxa"/>
-              <w:end w:w="115" w:type="dxa"/>
+              <w:top w:w="80" w:type="dxa"/>
+              <w:start w:w="100" w:type="dxa"/>
+              <w:bottom w:w="80" w:type="dxa"/>
+              <w:end w:w="100" w:type="dxa"/>
             </w:tcMar>
           </w:tcPr>
           <w:p>
             <w:pPr>
-              <w:spacing w:after="0" w:line="240" w:lineRule="auto"/>
+              <w:spacing w:after="0" w:line="245" w:lineRule="auto"/>
             </w:pPr>
             <w:r/>
             <w:r>
@@ -193,9 +256,9 @@
                 <w:rFonts w:ascii="Arial" w:hAnsi="Arial"/>
                 <w:b w:val="0"/>
                 <w:color w:val="182B43"/>
-                <w:sz w:val="17"/>
+                <w:sz w:val="15"/>
               </w:rPr>
-              <w:t>Controladores MVC, autenticación web, vistas Razor, estilos y portal estudiantil.</w:t>
+              <w:t>Procesa el inicio de sesión, el portal estudiantil y las acciones administrativas.</w:t>
             </w:r>
           </w:p>
         </w:tc>
@@ -203,19 +266,19 @@
       <w:tr>
         <w:tc>
           <w:tcPr>
-            <w:tcW w:type="dxa" w:w="2376"/>
+            <w:tcW w:type="dxa" w:w="3816"/>
             <w:vAlign w:val="center"/>
             <w:shd w:fill="FFFFFF"/>
             <w:tcMar>
-              <w:top w:w="95" w:type="dxa"/>
-              <w:start w:w="115" w:type="dxa"/>
-              <w:bottom w:w="95" w:type="dxa"/>
-              <w:end w:w="115" w:type="dxa"/>
+              <w:top w:w="80" w:type="dxa"/>
+              <w:start w:w="100" w:type="dxa"/>
+              <w:bottom w:w="80" w:type="dxa"/>
+              <w:end w:w="100" w:type="dxa"/>
             </w:tcMar>
           </w:tcPr>
           <w:p>
             <w:pPr>
-              <w:spacing w:after="0" w:line="240" w:lineRule="auto"/>
+              <w:spacing w:after="0" w:line="245" w:lineRule="auto"/>
             </w:pPr>
             <w:r/>
             <w:r>
@@ -223,7 +286,181 @@
                 <w:rFonts w:ascii="Arial" w:hAnsi="Arial"/>
                 <w:b/>
                 <w:color w:val="182B43"/>
-                <w:sz w:val="17"/>
+                <w:sz w:val="15"/>
+              </w:rPr>
+              <w:t>NBU.Web/Models</w:t>
+            </w:r>
+          </w:p>
+        </w:tc>
+        <w:tc>
+          <w:tcPr>
+            <w:tcW w:type="dxa" w:w="6077"/>
+            <w:vAlign w:val="center"/>
+            <w:shd w:fill="FFFFFF"/>
+            <w:tcMar>
+              <w:top w:w="80" w:type="dxa"/>
+              <w:start w:w="100" w:type="dxa"/>
+              <w:bottom w:w="80" w:type="dxa"/>
+              <w:end w:w="100" w:type="dxa"/>
+            </w:tcMar>
+          </w:tcPr>
+          <w:p>
+            <w:pPr>
+              <w:spacing w:after="0" w:line="245" w:lineRule="auto"/>
+            </w:pPr>
+            <w:r/>
+            <w:r>
+              <w:rPr>
+                <w:rFonts w:ascii="Arial" w:hAnsi="Arial"/>
+                <w:b w:val="0"/>
+                <w:color w:val="182B43"/>
+                <w:sz w:val="15"/>
+              </w:rPr>
+              <w:t>Define modelos de pantalla y reglas de validación.</w:t>
+            </w:r>
+          </w:p>
+        </w:tc>
+      </w:tr>
+      <w:tr>
+        <w:tc>
+          <w:tcPr>
+            <w:tcW w:type="dxa" w:w="3816"/>
+            <w:vAlign w:val="center"/>
+            <w:shd w:fill="EFF5FA"/>
+            <w:tcMar>
+              <w:top w:w="80" w:type="dxa"/>
+              <w:start w:w="100" w:type="dxa"/>
+              <w:bottom w:w="80" w:type="dxa"/>
+              <w:end w:w="100" w:type="dxa"/>
+            </w:tcMar>
+          </w:tcPr>
+          <w:p>
+            <w:pPr>
+              <w:spacing w:after="0" w:line="245" w:lineRule="auto"/>
+            </w:pPr>
+            <w:r/>
+            <w:r>
+              <w:rPr>
+                <w:rFonts w:ascii="Arial" w:hAnsi="Arial"/>
+                <w:b/>
+                <w:color w:val="182B43"/>
+                <w:sz w:val="15"/>
+              </w:rPr>
+              <w:t>NBU.Web/Views</w:t>
+            </w:r>
+          </w:p>
+        </w:tc>
+        <w:tc>
+          <w:tcPr>
+            <w:tcW w:type="dxa" w:w="6077"/>
+            <w:vAlign w:val="center"/>
+            <w:shd w:fill="EFF5FA"/>
+            <w:tcMar>
+              <w:top w:w="80" w:type="dxa"/>
+              <w:start w:w="100" w:type="dxa"/>
+              <w:bottom w:w="80" w:type="dxa"/>
+              <w:end w:w="100" w:type="dxa"/>
+            </w:tcMar>
+          </w:tcPr>
+          <w:p>
+            <w:pPr>
+              <w:spacing w:after="0" w:line="245" w:lineRule="auto"/>
+            </w:pPr>
+            <w:r/>
+            <w:r>
+              <w:rPr>
+                <w:rFonts w:ascii="Arial" w:hAnsi="Arial"/>
+                <w:b w:val="0"/>
+                <w:color w:val="182B43"/>
+                <w:sz w:val="15"/>
+              </w:rPr>
+              <w:t>Contiene las páginas Razor; StudentPortal reúne las páginas del estudiante.</w:t>
+            </w:r>
+          </w:p>
+        </w:tc>
+      </w:tr>
+      <w:tr>
+        <w:tc>
+          <w:tcPr>
+            <w:tcW w:type="dxa" w:w="3816"/>
+            <w:vAlign w:val="center"/>
+            <w:shd w:fill="FFFFFF"/>
+            <w:tcMar>
+              <w:top w:w="80" w:type="dxa"/>
+              <w:start w:w="100" w:type="dxa"/>
+              <w:bottom w:w="80" w:type="dxa"/>
+              <w:end w:w="100" w:type="dxa"/>
+            </w:tcMar>
+          </w:tcPr>
+          <w:p>
+            <w:pPr>
+              <w:spacing w:after="0" w:line="245" w:lineRule="auto"/>
+            </w:pPr>
+            <w:r/>
+            <w:r>
+              <w:rPr>
+                <w:rFonts w:ascii="Arial" w:hAnsi="Arial"/>
+                <w:b/>
+                <w:color w:val="182B43"/>
+                <w:sz w:val="15"/>
+              </w:rPr>
+              <w:t>NBU.Web/wwwroot</w:t>
+            </w:r>
+          </w:p>
+        </w:tc>
+        <w:tc>
+          <w:tcPr>
+            <w:tcW w:type="dxa" w:w="6077"/>
+            <w:vAlign w:val="center"/>
+            <w:shd w:fill="FFFFFF"/>
+            <w:tcMar>
+              <w:top w:w="80" w:type="dxa"/>
+              <w:start w:w="100" w:type="dxa"/>
+              <w:bottom w:w="80" w:type="dxa"/>
+              <w:end w:w="100" w:type="dxa"/>
+            </w:tcMar>
+          </w:tcPr>
+          <w:p>
+            <w:pPr>
+              <w:spacing w:after="0" w:line="245" w:lineRule="auto"/>
+            </w:pPr>
+            <w:r/>
+            <w:r>
+              <w:rPr>
+                <w:rFonts w:ascii="Arial" w:hAnsi="Arial"/>
+                <w:b w:val="0"/>
+                <w:color w:val="182B43"/>
+                <w:sz w:val="15"/>
+              </w:rPr>
+              <w:t>Guarda CSS, JavaScript, recursos Bootstrap e imágenes, incluido el símbolo NBU.</w:t>
+            </w:r>
+          </w:p>
+        </w:tc>
+      </w:tr>
+      <w:tr>
+        <w:tc>
+          <w:tcPr>
+            <w:tcW w:type="dxa" w:w="3816"/>
+            <w:vAlign w:val="center"/>
+            <w:shd w:fill="EFF5FA"/>
+            <w:tcMar>
+              <w:top w:w="80" w:type="dxa"/>
+              <w:start w:w="100" w:type="dxa"/>
+              <w:bottom w:w="80" w:type="dxa"/>
+              <w:end w:w="100" w:type="dxa"/>
+            </w:tcMar>
+          </w:tcPr>
+          <w:p>
+            <w:pPr>
+              <w:spacing w:after="0" w:line="245" w:lineRule="auto"/>
+            </w:pPr>
+            <w:r/>
+            <w:r>
+              <w:rPr>
+                <w:rFonts w:ascii="Arial" w:hAnsi="Arial"/>
+                <w:b/>
+                <w:color w:val="182B43"/>
+                <w:sz w:val="15"/>
               </w:rPr>
               <w:t>NBU.Desktop</w:t>
             </w:r>
@@ -231,19 +468,19 @@
         </w:tc>
         <w:tc>
           <w:tcPr>
-            <w:tcW w:type="dxa" w:w="8136"/>
+            <w:tcW w:type="dxa" w:w="6077"/>
             <w:vAlign w:val="center"/>
-            <w:shd w:fill="FFFFFF"/>
+            <w:shd w:fill="EFF5FA"/>
             <w:tcMar>
-              <w:top w:w="95" w:type="dxa"/>
-              <w:start w:w="115" w:type="dxa"/>
-              <w:bottom w:w="95" w:type="dxa"/>
-              <w:end w:w="115" w:type="dxa"/>
+              <w:top w:w="80" w:type="dxa"/>
+              <w:start w:w="100" w:type="dxa"/>
+              <w:bottom w:w="80" w:type="dxa"/>
+              <w:end w:w="100" w:type="dxa"/>
             </w:tcMar>
           </w:tcPr>
           <w:p>
             <w:pPr>
-              <w:spacing w:after="0" w:line="240" w:lineRule="auto"/>
+              <w:spacing w:after="0" w:line="245" w:lineRule="auto"/>
             </w:pPr>
             <w:r/>
             <w:r>
@@ -251,9 +488,9 @@
                 <w:rFonts w:ascii="Arial" w:hAnsi="Arial"/>
                 <w:b w:val="0"/>
                 <w:color w:val="182B43"/>
-                <w:sz w:val="17"/>
+                <w:sz w:val="15"/>
               </w:rPr>
-              <w:t>Acceso administrativo y formularios Windows Forms para administrar los módulos.</w:t>
+              <w:t>Aplicación Windows Forms, formularios, navegación y operaciones CRUD.</w:t>
             </w:r>
           </w:p>
         </w:tc>
@@ -261,19 +498,19 @@
       <w:tr>
         <w:tc>
           <w:tcPr>
-            <w:tcW w:type="dxa" w:w="2376"/>
+            <w:tcW w:type="dxa" w:w="3816"/>
             <w:vAlign w:val="center"/>
-            <w:shd w:fill="EFF5FA"/>
+            <w:shd w:fill="FFFFFF"/>
             <w:tcMar>
-              <w:top w:w="95" w:type="dxa"/>
-              <w:start w:w="115" w:type="dxa"/>
-              <w:bottom w:w="95" w:type="dxa"/>
-              <w:end w:w="115" w:type="dxa"/>
+              <w:top w:w="80" w:type="dxa"/>
+              <w:start w:w="100" w:type="dxa"/>
+              <w:bottom w:w="80" w:type="dxa"/>
+              <w:end w:w="100" w:type="dxa"/>
             </w:tcMar>
           </w:tcPr>
           <w:p>
             <w:pPr>
-              <w:spacing w:after="0" w:line="240" w:lineRule="auto"/>
+              <w:spacing w:after="0" w:line="245" w:lineRule="auto"/>
             </w:pPr>
             <w:r/>
             <w:r>
@@ -281,27 +518,27 @@
                 <w:rFonts w:ascii="Arial" w:hAnsi="Arial"/>
                 <w:b/>
                 <w:color w:val="182B43"/>
-                <w:sz w:val="17"/>
+                <w:sz w:val="15"/>
               </w:rPr>
-              <w:t>NBU.Data</w:t>
+              <w:t>NBU.Data/Models</w:t>
             </w:r>
           </w:p>
         </w:tc>
         <w:tc>
           <w:tcPr>
-            <w:tcW w:type="dxa" w:w="8136"/>
+            <w:tcW w:type="dxa" w:w="6077"/>
             <w:vAlign w:val="center"/>
-            <w:shd w:fill="EFF5FA"/>
+            <w:shd w:fill="FFFFFF"/>
             <w:tcMar>
-              <w:top w:w="95" w:type="dxa"/>
-              <w:start w:w="115" w:type="dxa"/>
-              <w:bottom w:w="95" w:type="dxa"/>
-              <w:end w:w="115" w:type="dxa"/>
+              <w:top w:w="80" w:type="dxa"/>
+              <w:start w:w="100" w:type="dxa"/>
+              <w:bottom w:w="80" w:type="dxa"/>
+              <w:end w:w="100" w:type="dxa"/>
             </w:tcMar>
           </w:tcPr>
           <w:p>
             <w:pPr>
-              <w:spacing w:after="0" w:line="240" w:lineRule="auto"/>
+              <w:spacing w:after="0" w:line="245" w:lineRule="auto"/>
             </w:pPr>
             <w:r/>
             <w:r>
@@ -309,9 +546,125 @@
                 <w:rFonts w:ascii="Arial" w:hAnsi="Arial"/>
                 <w:b w:val="0"/>
                 <w:color w:val="182B43"/>
-                <w:sz w:val="17"/>
+                <w:sz w:val="15"/>
               </w:rPr>
-              <w:t>Entidades, AppDbContext, configuración EF Core y migraciones compartidas.</w:t>
+              <w:t>Entidades compartidas entre web y escritorio.</w:t>
+            </w:r>
+          </w:p>
+        </w:tc>
+      </w:tr>
+      <w:tr>
+        <w:tc>
+          <w:tcPr>
+            <w:tcW w:type="dxa" w:w="3816"/>
+            <w:vAlign w:val="center"/>
+            <w:shd w:fill="EFF5FA"/>
+            <w:tcMar>
+              <w:top w:w="80" w:type="dxa"/>
+              <w:start w:w="100" w:type="dxa"/>
+              <w:bottom w:w="80" w:type="dxa"/>
+              <w:end w:w="100" w:type="dxa"/>
+            </w:tcMar>
+          </w:tcPr>
+          <w:p>
+            <w:pPr>
+              <w:spacing w:after="0" w:line="245" w:lineRule="auto"/>
+            </w:pPr>
+            <w:r/>
+            <w:r>
+              <w:rPr>
+                <w:rFonts w:ascii="Arial" w:hAnsi="Arial"/>
+                <w:b/>
+                <w:color w:val="182B43"/>
+                <w:sz w:val="15"/>
+              </w:rPr>
+              <w:t>NBU.Data/AppDbContext.cs</w:t>
+            </w:r>
+          </w:p>
+        </w:tc>
+        <w:tc>
+          <w:tcPr>
+            <w:tcW w:type="dxa" w:w="6077"/>
+            <w:vAlign w:val="center"/>
+            <w:shd w:fill="EFF5FA"/>
+            <w:tcMar>
+              <w:top w:w="80" w:type="dxa"/>
+              <w:start w:w="100" w:type="dxa"/>
+              <w:bottom w:w="80" w:type="dxa"/>
+              <w:end w:w="100" w:type="dxa"/>
+            </w:tcMar>
+          </w:tcPr>
+          <w:p>
+            <w:pPr>
+              <w:spacing w:after="0" w:line="245" w:lineRule="auto"/>
+            </w:pPr>
+            <w:r/>
+            <w:r>
+              <w:rPr>
+                <w:rFonts w:ascii="Arial" w:hAnsi="Arial"/>
+                <w:b w:val="0"/>
+                <w:color w:val="182B43"/>
+                <w:sz w:val="15"/>
+              </w:rPr>
+              <w:t>Configura Entity Framework Core, índices y relaciones.</w:t>
+            </w:r>
+          </w:p>
+        </w:tc>
+      </w:tr>
+      <w:tr>
+        <w:tc>
+          <w:tcPr>
+            <w:tcW w:type="dxa" w:w="3816"/>
+            <w:vAlign w:val="center"/>
+            <w:shd w:fill="FFFFFF"/>
+            <w:tcMar>
+              <w:top w:w="80" w:type="dxa"/>
+              <w:start w:w="100" w:type="dxa"/>
+              <w:bottom w:w="80" w:type="dxa"/>
+              <w:end w:w="100" w:type="dxa"/>
+            </w:tcMar>
+          </w:tcPr>
+          <w:p>
+            <w:pPr>
+              <w:spacing w:after="0" w:line="245" w:lineRule="auto"/>
+            </w:pPr>
+            <w:r/>
+            <w:r>
+              <w:rPr>
+                <w:rFonts w:ascii="Arial" w:hAnsi="Arial"/>
+                <w:b/>
+                <w:color w:val="182B43"/>
+                <w:sz w:val="15"/>
+              </w:rPr>
+              <w:t>NBU.Data/Migrations + database/NBU.sql</w:t>
+            </w:r>
+          </w:p>
+        </w:tc>
+        <w:tc>
+          <w:tcPr>
+            <w:tcW w:type="dxa" w:w="6077"/>
+            <w:vAlign w:val="center"/>
+            <w:shd w:fill="FFFFFF"/>
+            <w:tcMar>
+              <w:top w:w="80" w:type="dxa"/>
+              <w:start w:w="100" w:type="dxa"/>
+              <w:bottom w:w="80" w:type="dxa"/>
+              <w:end w:w="100" w:type="dxa"/>
+            </w:tcMar>
+          </w:tcPr>
+          <w:p>
+            <w:pPr>
+              <w:spacing w:after="0" w:line="245" w:lineRule="auto"/>
+            </w:pPr>
+            <w:r/>
+            <w:r>
+              <w:rPr>
+                <w:rFonts w:ascii="Arial" w:hAnsi="Arial"/>
+                <w:b w:val="0"/>
+                <w:color w:val="182B43"/>
+                <w:sz w:val="15"/>
+              </w:rPr>
+              <w:t>Historial del esquema y script SQL para crear/actualizar la base.</w:t>
             </w:r>
           </w:p>
         </w:tc>
@@ -319,39 +672,23 @@
     </w:tbl>
     <w:p>
       <w:pPr>
-        <w:spacing w:after="0"/>
-      </w:pPr>
-    </w:p>
-    <w:p>
-      <w:pPr>
-        <w:widowControl/>
-      </w:pPr>
-      <w:r>
-        <w:rPr>
-          <w:rFonts w:ascii="Arial" w:hAnsi="Arial"/>
-          <w:color w:val="182B43"/>
-        </w:rPr>
-        <w:t>En MVC, los modelos describen los datos; los controladores validan solicitudes y coordinan el acceso al contexto; las vistas Razor presentan las pantallas. En escritorio, los formularios capturan y muestran información y el administrador CRUD realiza operaciones sobre las mismas entidades.</w:t>
-      </w:r>
-    </w:p>
-    <w:p>
-      <w:pPr>
         <w:pStyle w:val="Heading2"/>
       </w:pPr>
       <w:r>
-        <w:t>Estructura principal del repositorio</w:t>
+        <w:t>Qué significa MVC en este proyecto</w:t>
       </w:r>
     </w:p>
     <w:tbl>
       <w:tblPr>
+        <w:tblStyle w:val="TableGrid"/>
         <w:tblW w:type="auto" w:w="0"/>
         <w:jc w:val="center"/>
         <w:tblLayout w:type="fixed"/>
         <w:tblLook w:firstColumn="1" w:firstRow="1" w:lastColumn="0" w:lastRow="0" w:noHBand="0" w:noVBand="1" w:val="04A0"/>
       </w:tblPr>
       <w:tblGrid>
-        <w:gridCol w:w="2880"/>
-        <w:gridCol w:w="7632"/>
+        <w:gridCol w:w="1800"/>
+        <w:gridCol w:w="8093"/>
       </w:tblGrid>
       <w:tr>
         <w:trPr>
@@ -359,19 +696,19 @@
         </w:trPr>
         <w:tc>
           <w:tcPr>
-            <w:tcW w:type="dxa" w:w="2880"/>
+            <w:tcW w:type="dxa" w:w="1800"/>
+            <w:vAlign w:val="center"/>
             <w:shd w:fill="092754"/>
             <w:tcMar>
-              <w:top w:w="95" w:type="dxa"/>
-              <w:start w:w="115" w:type="dxa"/>
-              <w:bottom w:w="95" w:type="dxa"/>
-              <w:end w:w="115" w:type="dxa"/>
+              <w:top w:w="80" w:type="dxa"/>
+              <w:start w:w="100" w:type="dxa"/>
+              <w:bottom w:w="80" w:type="dxa"/>
+              <w:end w:w="100" w:type="dxa"/>
             </w:tcMar>
-            <w:vAlign w:val="center"/>
           </w:tcPr>
           <w:p>
             <w:pPr>
-              <w:spacing w:after="0"/>
+              <w:spacing w:after="0" w:line="245" w:lineRule="auto"/>
             </w:pPr>
             <w:r/>
             <w:r>
@@ -381,25 +718,25 @@
                 <w:color w:val="FFFFFF"/>
                 <w:sz w:val="16"/>
               </w:rPr>
-              <w:t>Carpeta</w:t>
+              <w:t>Parte</w:t>
             </w:r>
           </w:p>
         </w:tc>
         <w:tc>
           <w:tcPr>
-            <w:tcW w:type="dxa" w:w="7632"/>
+            <w:tcW w:type="dxa" w:w="8093"/>
+            <w:vAlign w:val="center"/>
             <w:shd w:fill="092754"/>
             <w:tcMar>
-              <w:top w:w="95" w:type="dxa"/>
-              <w:start w:w="115" w:type="dxa"/>
-              <w:bottom w:w="95" w:type="dxa"/>
-              <w:end w:w="115" w:type="dxa"/>
+              <w:top w:w="80" w:type="dxa"/>
+              <w:start w:w="100" w:type="dxa"/>
+              <w:bottom w:w="80" w:type="dxa"/>
+              <w:end w:w="100" w:type="dxa"/>
             </w:tcMar>
-            <w:vAlign w:val="center"/>
           </w:tcPr>
           <w:p>
             <w:pPr>
-              <w:spacing w:after="0"/>
+              <w:spacing w:after="0" w:line="245" w:lineRule="auto"/>
             </w:pPr>
             <w:r/>
             <w:r>
@@ -409,7 +746,7 @@
                 <w:color w:val="FFFFFF"/>
                 <w:sz w:val="16"/>
               </w:rPr>
-              <w:t>Contenido</w:t>
+              <w:t>Explicación aplicada a NBU</w:t>
             </w:r>
           </w:p>
         </w:tc>
@@ -417,19 +754,19 @@
       <w:tr>
         <w:tc>
           <w:tcPr>
-            <w:tcW w:type="dxa" w:w="2880"/>
+            <w:tcW w:type="dxa" w:w="1800"/>
             <w:vAlign w:val="center"/>
             <w:shd w:fill="EFF5FA"/>
             <w:tcMar>
-              <w:top w:w="95" w:type="dxa"/>
-              <w:start w:w="115" w:type="dxa"/>
-              <w:bottom w:w="95" w:type="dxa"/>
-              <w:end w:w="115" w:type="dxa"/>
+              <w:top w:w="80" w:type="dxa"/>
+              <w:start w:w="100" w:type="dxa"/>
+              <w:bottom w:w="80" w:type="dxa"/>
+              <w:end w:w="100" w:type="dxa"/>
             </w:tcMar>
           </w:tcPr>
           <w:p>
             <w:pPr>
-              <w:spacing w:after="0" w:line="240" w:lineRule="auto"/>
+              <w:spacing w:after="0" w:line="245" w:lineRule="auto"/>
             </w:pPr>
             <w:r/>
             <w:r>
@@ -439,25 +776,25 @@
                 <w:color w:val="182B43"/>
                 <w:sz w:val="16"/>
               </w:rPr>
-              <w:t>NBU.Web/Controllers</w:t>
+              <w:t>Modelo</w:t>
             </w:r>
           </w:p>
         </w:tc>
         <w:tc>
           <w:tcPr>
-            <w:tcW w:type="dxa" w:w="7632"/>
+            <w:tcW w:type="dxa" w:w="8093"/>
             <w:vAlign w:val="center"/>
             <w:shd w:fill="EFF5FA"/>
             <w:tcMar>
-              <w:top w:w="95" w:type="dxa"/>
-              <w:start w:w="115" w:type="dxa"/>
-              <w:bottom w:w="95" w:type="dxa"/>
-              <w:end w:w="115" w:type="dxa"/>
+              <w:top w:w="80" w:type="dxa"/>
+              <w:start w:w="100" w:type="dxa"/>
+              <w:bottom w:w="80" w:type="dxa"/>
+              <w:end w:w="100" w:type="dxa"/>
             </w:tcMar>
           </w:tcPr>
           <w:p>
             <w:pPr>
-              <w:spacing w:after="0" w:line="240" w:lineRule="auto"/>
+              <w:spacing w:after="0" w:line="245" w:lineRule="auto"/>
             </w:pPr>
             <w:r/>
             <w:r>
@@ -467,7 +804,7 @@
                 <w:color w:val="182B43"/>
                 <w:sz w:val="16"/>
               </w:rPr>
-              <w:t>Controladores de acceso, portal y módulos administrativos.</w:t>
+              <w:t>Describe estudiantes, becas, solicitudes, depósitos y publicaciones.</w:t>
             </w:r>
           </w:p>
         </w:tc>
@@ -475,19 +812,19 @@
       <w:tr>
         <w:tc>
           <w:tcPr>
-            <w:tcW w:type="dxa" w:w="2880"/>
+            <w:tcW w:type="dxa" w:w="1800"/>
             <w:vAlign w:val="center"/>
             <w:shd w:fill="FFFFFF"/>
             <w:tcMar>
-              <w:top w:w="95" w:type="dxa"/>
-              <w:start w:w="115" w:type="dxa"/>
-              <w:bottom w:w="95" w:type="dxa"/>
-              <w:end w:w="115" w:type="dxa"/>
+              <w:top w:w="80" w:type="dxa"/>
+              <w:start w:w="100" w:type="dxa"/>
+              <w:bottom w:w="80" w:type="dxa"/>
+              <w:end w:w="100" w:type="dxa"/>
             </w:tcMar>
           </w:tcPr>
           <w:p>
             <w:pPr>
-              <w:spacing w:after="0" w:line="240" w:lineRule="auto"/>
+              <w:spacing w:after="0" w:line="245" w:lineRule="auto"/>
             </w:pPr>
             <w:r/>
             <w:r>
@@ -497,25 +834,25 @@
                 <w:color w:val="182B43"/>
                 <w:sz w:val="16"/>
               </w:rPr>
-              <w:t>NBU.Web/Models</w:t>
+              <w:t>Vista</w:t>
             </w:r>
           </w:p>
         </w:tc>
         <w:tc>
           <w:tcPr>
-            <w:tcW w:type="dxa" w:w="7632"/>
+            <w:tcW w:type="dxa" w:w="8093"/>
             <w:vAlign w:val="center"/>
             <w:shd w:fill="FFFFFF"/>
             <w:tcMar>
-              <w:top w:w="95" w:type="dxa"/>
-              <w:start w:w="115" w:type="dxa"/>
-              <w:bottom w:w="95" w:type="dxa"/>
-              <w:end w:w="115" w:type="dxa"/>
+              <w:top w:w="80" w:type="dxa"/>
+              <w:start w:w="100" w:type="dxa"/>
+              <w:bottom w:w="80" w:type="dxa"/>
+              <w:end w:w="100" w:type="dxa"/>
             </w:tcMar>
           </w:tcPr>
           <w:p>
             <w:pPr>
-              <w:spacing w:after="0" w:line="240" w:lineRule="auto"/>
+              <w:spacing w:after="0" w:line="245" w:lineRule="auto"/>
             </w:pPr>
             <w:r/>
             <w:r>
@@ -525,7 +862,7 @@
                 <w:color w:val="182B43"/>
                 <w:sz w:val="16"/>
               </w:rPr>
-              <w:t>Modelos de pantalla y validación.</w:t>
+              <w:t>Muestra pantallas Razor y formularios web.</w:t>
             </w:r>
           </w:p>
         </w:tc>
@@ -533,19 +870,19 @@
       <w:tr>
         <w:tc>
           <w:tcPr>
-            <w:tcW w:type="dxa" w:w="2880"/>
+            <w:tcW w:type="dxa" w:w="1800"/>
             <w:vAlign w:val="center"/>
             <w:shd w:fill="EFF5FA"/>
             <w:tcMar>
-              <w:top w:w="95" w:type="dxa"/>
-              <w:start w:w="115" w:type="dxa"/>
-              <w:bottom w:w="95" w:type="dxa"/>
-              <w:end w:w="115" w:type="dxa"/>
+              <w:top w:w="80" w:type="dxa"/>
+              <w:start w:w="100" w:type="dxa"/>
+              <w:bottom w:w="80" w:type="dxa"/>
+              <w:end w:w="100" w:type="dxa"/>
             </w:tcMar>
           </w:tcPr>
           <w:p>
             <w:pPr>
-              <w:spacing w:after="0" w:line="240" w:lineRule="auto"/>
+              <w:spacing w:after="0" w:line="245" w:lineRule="auto"/>
             </w:pPr>
             <w:r/>
             <w:r>
@@ -555,25 +892,25 @@
                 <w:color w:val="182B43"/>
                 <w:sz w:val="16"/>
               </w:rPr>
-              <w:t>NBU.Web/Views</w:t>
+              <w:t>Controlador</w:t>
             </w:r>
           </w:p>
         </w:tc>
         <w:tc>
           <w:tcPr>
-            <w:tcW w:type="dxa" w:w="7632"/>
+            <w:tcW w:type="dxa" w:w="8093"/>
             <w:vAlign w:val="center"/>
             <w:shd w:fill="EFF5FA"/>
             <w:tcMar>
-              <w:top w:w="95" w:type="dxa"/>
-              <w:start w:w="115" w:type="dxa"/>
-              <w:bottom w:w="95" w:type="dxa"/>
-              <w:end w:w="115" w:type="dxa"/>
+              <w:top w:w="80" w:type="dxa"/>
+              <w:start w:w="100" w:type="dxa"/>
+              <w:bottom w:w="80" w:type="dxa"/>
+              <w:end w:w="100" w:type="dxa"/>
             </w:tcMar>
           </w:tcPr>
           <w:p>
             <w:pPr>
-              <w:spacing w:after="0" w:line="240" w:lineRule="auto"/>
+              <w:spacing w:after="0" w:line="245" w:lineRule="auto"/>
             </w:pPr>
             <w:r/>
             <w:r>
@@ -583,307 +920,68 @@
                 <w:color w:val="182B43"/>
                 <w:sz w:val="16"/>
               </w:rPr>
-              <w:t>Vistas Razor; StudentPortal contiene las pantallas del estudiante.</w:t>
-            </w:r>
-          </w:p>
-        </w:tc>
-      </w:tr>
-      <w:tr>
-        <w:tc>
-          <w:tcPr>
-            <w:tcW w:type="dxa" w:w="2880"/>
-            <w:vAlign w:val="center"/>
-            <w:shd w:fill="FFFFFF"/>
-            <w:tcMar>
-              <w:top w:w="95" w:type="dxa"/>
-              <w:start w:w="115" w:type="dxa"/>
-              <w:bottom w:w="95" w:type="dxa"/>
-              <w:end w:w="115" w:type="dxa"/>
-            </w:tcMar>
-          </w:tcPr>
-          <w:p>
-            <w:pPr>
-              <w:spacing w:after="0" w:line="240" w:lineRule="auto"/>
-            </w:pPr>
-            <w:r/>
-            <w:r>
-              <w:rPr>
-                <w:rFonts w:ascii="Arial" w:hAnsi="Arial"/>
-                <w:b/>
-                <w:color w:val="182B43"/>
-                <w:sz w:val="16"/>
-              </w:rPr>
-              <w:t>NBU.Web/wwwroot</w:t>
-            </w:r>
-          </w:p>
-        </w:tc>
-        <w:tc>
-          <w:tcPr>
-            <w:tcW w:type="dxa" w:w="7632"/>
-            <w:vAlign w:val="center"/>
-            <w:shd w:fill="FFFFFF"/>
-            <w:tcMar>
-              <w:top w:w="95" w:type="dxa"/>
-              <w:start w:w="115" w:type="dxa"/>
-              <w:bottom w:w="95" w:type="dxa"/>
-              <w:end w:w="115" w:type="dxa"/>
-            </w:tcMar>
-          </w:tcPr>
-          <w:p>
-            <w:pPr>
-              <w:spacing w:after="0" w:line="240" w:lineRule="auto"/>
-            </w:pPr>
-            <w:r/>
-            <w:r>
-              <w:rPr>
-                <w:rFonts w:ascii="Arial" w:hAnsi="Arial"/>
-                <w:b w:val="0"/>
-                <w:color w:val="182B43"/>
-                <w:sz w:val="16"/>
-              </w:rPr>
-              <w:t>CSS, JavaScript y bibliotecas web.</w:t>
-            </w:r>
-          </w:p>
-        </w:tc>
-      </w:tr>
-      <w:tr>
-        <w:tc>
-          <w:tcPr>
-            <w:tcW w:type="dxa" w:w="2880"/>
-            <w:vAlign w:val="center"/>
-            <w:shd w:fill="EFF5FA"/>
-            <w:tcMar>
-              <w:top w:w="95" w:type="dxa"/>
-              <w:start w:w="115" w:type="dxa"/>
-              <w:bottom w:w="95" w:type="dxa"/>
-              <w:end w:w="115" w:type="dxa"/>
-            </w:tcMar>
-          </w:tcPr>
-          <w:p>
-            <w:pPr>
-              <w:spacing w:after="0" w:line="240" w:lineRule="auto"/>
-            </w:pPr>
-            <w:r/>
-            <w:r>
-              <w:rPr>
-                <w:rFonts w:ascii="Arial" w:hAnsi="Arial"/>
-                <w:b/>
-                <w:color w:val="182B43"/>
-                <w:sz w:val="16"/>
-              </w:rPr>
-              <w:t>NBU.Data/Models</w:t>
-            </w:r>
-          </w:p>
-        </w:tc>
-        <w:tc>
-          <w:tcPr>
-            <w:tcW w:type="dxa" w:w="7632"/>
-            <w:vAlign w:val="center"/>
-            <w:shd w:fill="EFF5FA"/>
-            <w:tcMar>
-              <w:top w:w="95" w:type="dxa"/>
-              <w:start w:w="115" w:type="dxa"/>
-              <w:bottom w:w="95" w:type="dxa"/>
-              <w:end w:w="115" w:type="dxa"/>
-            </w:tcMar>
-          </w:tcPr>
-          <w:p>
-            <w:pPr>
-              <w:spacing w:after="0" w:line="240" w:lineRule="auto"/>
-            </w:pPr>
-            <w:r/>
-            <w:r>
-              <w:rPr>
-                <w:rFonts w:ascii="Arial" w:hAnsi="Arial"/>
-                <w:b w:val="0"/>
-                <w:color w:val="182B43"/>
-                <w:sz w:val="16"/>
-              </w:rPr>
-              <w:t>Entidades Student, Scholarship, ScholarshipApplication, Payment, Publication, Notification y NbuUser.</w:t>
-            </w:r>
-          </w:p>
-        </w:tc>
-      </w:tr>
-      <w:tr>
-        <w:tc>
-          <w:tcPr>
-            <w:tcW w:type="dxa" w:w="2880"/>
-            <w:vAlign w:val="center"/>
-            <w:shd w:fill="FFFFFF"/>
-            <w:tcMar>
-              <w:top w:w="95" w:type="dxa"/>
-              <w:start w:w="115" w:type="dxa"/>
-              <w:bottom w:w="95" w:type="dxa"/>
-              <w:end w:w="115" w:type="dxa"/>
-            </w:tcMar>
-          </w:tcPr>
-          <w:p>
-            <w:pPr>
-              <w:spacing w:after="0" w:line="240" w:lineRule="auto"/>
-            </w:pPr>
-            <w:r/>
-            <w:r>
-              <w:rPr>
-                <w:rFonts w:ascii="Arial" w:hAnsi="Arial"/>
-                <w:b/>
-                <w:color w:val="182B43"/>
-                <w:sz w:val="16"/>
-              </w:rPr>
-              <w:t>NBU.Data/Migrations</w:t>
-            </w:r>
-          </w:p>
-        </w:tc>
-        <w:tc>
-          <w:tcPr>
-            <w:tcW w:type="dxa" w:w="7632"/>
-            <w:vAlign w:val="center"/>
-            <w:shd w:fill="FFFFFF"/>
-            <w:tcMar>
-              <w:top w:w="95" w:type="dxa"/>
-              <w:start w:w="115" w:type="dxa"/>
-              <w:bottom w:w="95" w:type="dxa"/>
-              <w:end w:w="115" w:type="dxa"/>
-            </w:tcMar>
-          </w:tcPr>
-          <w:p>
-            <w:pPr>
-              <w:spacing w:after="0" w:line="240" w:lineRule="auto"/>
-            </w:pPr>
-            <w:r/>
-            <w:r>
-              <w:rPr>
-                <w:rFonts w:ascii="Arial" w:hAnsi="Arial"/>
-                <w:b w:val="0"/>
-                <w:color w:val="182B43"/>
-                <w:sz w:val="16"/>
-              </w:rPr>
-              <w:t>Historial de cambios del esquema generado por EF Core.</w:t>
-            </w:r>
-          </w:p>
-        </w:tc>
-      </w:tr>
-      <w:tr>
-        <w:tc>
-          <w:tcPr>
-            <w:tcW w:type="dxa" w:w="2880"/>
-            <w:vAlign w:val="center"/>
-            <w:shd w:fill="EFF5FA"/>
-            <w:tcMar>
-              <w:top w:w="95" w:type="dxa"/>
-              <w:start w:w="115" w:type="dxa"/>
-              <w:bottom w:w="95" w:type="dxa"/>
-              <w:end w:w="115" w:type="dxa"/>
-            </w:tcMar>
-          </w:tcPr>
-          <w:p>
-            <w:pPr>
-              <w:spacing w:after="0" w:line="240" w:lineRule="auto"/>
-            </w:pPr>
-            <w:r/>
-            <w:r>
-              <w:rPr>
-                <w:rFonts w:ascii="Arial" w:hAnsi="Arial"/>
-                <w:b/>
-                <w:color w:val="182B43"/>
-                <w:sz w:val="16"/>
-              </w:rPr>
-              <w:t>NBU.Desktop</w:t>
-            </w:r>
-          </w:p>
-        </w:tc>
-        <w:tc>
-          <w:tcPr>
-            <w:tcW w:type="dxa" w:w="7632"/>
-            <w:vAlign w:val="center"/>
-            <w:shd w:fill="EFF5FA"/>
-            <w:tcMar>
-              <w:top w:w="95" w:type="dxa"/>
-              <w:start w:w="115" w:type="dxa"/>
-              <w:bottom w:w="95" w:type="dxa"/>
-              <w:end w:w="115" w:type="dxa"/>
-            </w:tcMar>
-          </w:tcPr>
-          <w:p>
-            <w:pPr>
-              <w:spacing w:after="0" w:line="240" w:lineRule="auto"/>
-            </w:pPr>
-            <w:r/>
-            <w:r>
-              <w:rPr>
-                <w:rFonts w:ascii="Arial" w:hAnsi="Arial"/>
-                <w:b w:val="0"/>
-                <w:color w:val="182B43"/>
-                <w:sz w:val="16"/>
-              </w:rPr>
-              <w:t>Programa, inicio de sesión administrativo, formularios y control CRUD.</w:t>
-            </w:r>
-          </w:p>
-        </w:tc>
-      </w:tr>
-      <w:tr>
-        <w:tc>
-          <w:tcPr>
-            <w:tcW w:type="dxa" w:w="2880"/>
-            <w:vAlign w:val="center"/>
-            <w:shd w:fill="FFFFFF"/>
-            <w:tcMar>
-              <w:top w:w="95" w:type="dxa"/>
-              <w:start w:w="115" w:type="dxa"/>
-              <w:bottom w:w="95" w:type="dxa"/>
-              <w:end w:w="115" w:type="dxa"/>
-            </w:tcMar>
-          </w:tcPr>
-          <w:p>
-            <w:pPr>
-              <w:spacing w:after="0" w:line="240" w:lineRule="auto"/>
-            </w:pPr>
-            <w:r/>
-            <w:r>
-              <w:rPr>
-                <w:rFonts w:ascii="Arial" w:hAnsi="Arial"/>
-                <w:b/>
-                <w:color w:val="182B43"/>
-                <w:sz w:val="16"/>
-              </w:rPr>
-              <w:t>database/NBU.sql</w:t>
-            </w:r>
-          </w:p>
-        </w:tc>
-        <w:tc>
-          <w:tcPr>
-            <w:tcW w:type="dxa" w:w="7632"/>
-            <w:vAlign w:val="center"/>
-            <w:shd w:fill="FFFFFF"/>
-            <w:tcMar>
-              <w:top w:w="95" w:type="dxa"/>
-              <w:start w:w="115" w:type="dxa"/>
-              <w:bottom w:w="95" w:type="dxa"/>
-              <w:end w:w="115" w:type="dxa"/>
-            </w:tcMar>
-          </w:tcPr>
-          <w:p>
-            <w:pPr>
-              <w:spacing w:after="0" w:line="240" w:lineRule="auto"/>
-            </w:pPr>
-            <w:r/>
-            <w:r>
-              <w:rPr>
-                <w:rFonts w:ascii="Arial" w:hAnsi="Arial"/>
-                <w:b w:val="0"/>
-                <w:color w:val="182B43"/>
-                <w:sz w:val="16"/>
-              </w:rPr>
-              <w:t>Script idempotente para aplicar las migraciones en SQL Server.</w:t>
+              <w:t>Recibe la acción, valida los datos y coordina la lectura o escritura.</w:t>
             </w:r>
           </w:p>
         </w:tc>
       </w:tr>
     </w:tbl>
-    <w:p>
-      <w:pPr>
-        <w:spacing w:after="0"/>
-      </w:pPr>
-    </w:p>
+    <w:tbl>
+      <w:tblPr>
+        <w:tblStyle w:val="TableGrid"/>
+        <w:tblW w:type="auto" w:w="0"/>
+        <w:tblLook w:firstColumn="1" w:firstRow="1" w:lastColumn="0" w:lastRow="0" w:noHBand="0" w:noVBand="1" w:val="04A0"/>
+      </w:tblPr>
+      <w:tblGrid>
+        <w:gridCol w:w="9893"/>
+      </w:tblGrid>
+      <w:tr>
+        <w:tc>
+          <w:tcPr>
+            <w:tcW w:type="dxa" w:w="9893"/>
+            <w:vAlign w:val="center"/>
+            <w:shd w:fill="EAF8F8"/>
+            <w:tcMar>
+              <w:top w:w="80" w:type="dxa"/>
+              <w:start w:w="100" w:type="dxa"/>
+              <w:bottom w:w="80" w:type="dxa"/>
+              <w:end w:w="100" w:type="dxa"/>
+            </w:tcMar>
+          </w:tcPr>
+          <w:p>
+            <w:pPr>
+              <w:spacing w:after="0" w:line="245" w:lineRule="auto"/>
+            </w:pPr>
+            <w:r>
+              <w:rPr>
+                <w:b/>
+              </w:rPr>
+            </w:r>
+            <w:r>
+              <w:rPr>
+                <w:rFonts w:ascii="Arial" w:hAnsi="Arial"/>
+                <w:b w:val="0"/>
+                <w:color w:val="092754"/>
+                <w:sz w:val="18"/>
+              </w:rPr>
+              <w:t>La idea importante</w:t>
+            </w:r>
+            <w:r>
+              <w:br/>
+            </w:r>
+            <w:r>
+              <w:rPr>
+                <w:rFonts w:ascii="Arial" w:hAnsi="Arial"/>
+                <w:b w:val="0"/>
+                <w:color w:val="092754"/>
+                <w:sz w:val="18"/>
+              </w:rPr>
+              <w:t>La web y el programa de escritorio son dos puertas para trabajar con la misma información guardada en SQL Server.</w:t>
+            </w:r>
+          </w:p>
+        </w:tc>
+      </w:tr>
+    </w:tbl>
     <w:p>
       <w:r>
         <w:br w:type="page"/>
@@ -894,19 +992,20 @@
         <w:pStyle w:val="Heading1"/>
       </w:pPr>
       <w:r>
-        <w:t>3. Modelo de datos</w:t>
+        <w:t>3. Base de datos y relaciones</w:t>
       </w:r>
     </w:p>
     <w:tbl>
       <w:tblPr>
+        <w:tblStyle w:val="TableGrid"/>
         <w:tblW w:type="auto" w:w="0"/>
         <w:jc w:val="center"/>
         <w:tblLayout w:type="fixed"/>
         <w:tblLook w:firstColumn="1" w:firstRow="1" w:lastColumn="0" w:lastRow="0" w:noHBand="0" w:noVBand="1" w:val="04A0"/>
       </w:tblPr>
       <w:tblGrid>
-        <w:gridCol w:w="2664"/>
-        <w:gridCol w:w="7848"/>
+        <w:gridCol w:w="3096"/>
+        <w:gridCol w:w="6797"/>
       </w:tblGrid>
       <w:tr>
         <w:trPr>
@@ -914,19 +1013,19 @@
         </w:trPr>
         <w:tc>
           <w:tcPr>
-            <w:tcW w:type="dxa" w:w="2664"/>
+            <w:tcW w:type="dxa" w:w="3096"/>
+            <w:vAlign w:val="center"/>
             <w:shd w:fill="092754"/>
             <w:tcMar>
-              <w:top w:w="95" w:type="dxa"/>
-              <w:start w:w="115" w:type="dxa"/>
-              <w:bottom w:w="95" w:type="dxa"/>
-              <w:end w:w="115" w:type="dxa"/>
+              <w:top w:w="80" w:type="dxa"/>
+              <w:start w:w="100" w:type="dxa"/>
+              <w:bottom w:w="80" w:type="dxa"/>
+              <w:end w:w="100" w:type="dxa"/>
             </w:tcMar>
-            <w:vAlign w:val="center"/>
           </w:tcPr>
           <w:p>
             <w:pPr>
-              <w:spacing w:after="0"/>
+              <w:spacing w:after="0" w:line="245" w:lineRule="auto"/>
             </w:pPr>
             <w:r/>
             <w:r>
@@ -936,25 +1035,25 @@
                 <w:color w:val="FFFFFF"/>
                 <w:sz w:val="16"/>
               </w:rPr>
-              <w:t>Entidad</w:t>
+              <w:t>Tabla/entidad</w:t>
             </w:r>
           </w:p>
         </w:tc>
         <w:tc>
           <w:tcPr>
-            <w:tcW w:type="dxa" w:w="7848"/>
+            <w:tcW w:type="dxa" w:w="6797"/>
+            <w:vAlign w:val="center"/>
             <w:shd w:fill="092754"/>
             <w:tcMar>
-              <w:top w:w="95" w:type="dxa"/>
-              <w:start w:w="115" w:type="dxa"/>
-              <w:bottom w:w="95" w:type="dxa"/>
-              <w:end w:w="115" w:type="dxa"/>
+              <w:top w:w="80" w:type="dxa"/>
+              <w:start w:w="100" w:type="dxa"/>
+              <w:bottom w:w="80" w:type="dxa"/>
+              <w:end w:w="100" w:type="dxa"/>
             </w:tcMar>
-            <w:vAlign w:val="center"/>
           </w:tcPr>
           <w:p>
             <w:pPr>
-              <w:spacing w:after="0"/>
+              <w:spacing w:after="0" w:line="245" w:lineRule="auto"/>
             </w:pPr>
             <w:r/>
             <w:r>
@@ -964,7 +1063,7 @@
                 <w:color w:val="FFFFFF"/>
                 <w:sz w:val="16"/>
               </w:rPr>
-              <w:t>Relaciones y datos principales</w:t>
+              <w:t>Datos que representa</w:t>
             </w:r>
           </w:p>
         </w:tc>
@@ -972,19 +1071,1051 @@
       <w:tr>
         <w:tc>
           <w:tcPr>
-            <w:tcW w:type="dxa" w:w="2664"/>
+            <w:tcW w:type="dxa" w:w="3096"/>
             <w:vAlign w:val="center"/>
             <w:shd w:fill="EFF5FA"/>
             <w:tcMar>
-              <w:top w:w="95" w:type="dxa"/>
-              <w:start w:w="115" w:type="dxa"/>
-              <w:bottom w:w="95" w:type="dxa"/>
-              <w:end w:w="115" w:type="dxa"/>
+              <w:top w:w="80" w:type="dxa"/>
+              <w:start w:w="100" w:type="dxa"/>
+              <w:bottom w:w="80" w:type="dxa"/>
+              <w:end w:w="100" w:type="dxa"/>
             </w:tcMar>
           </w:tcPr>
           <w:p>
             <w:pPr>
-              <w:spacing w:after="0" w:line="240" w:lineRule="auto"/>
+              <w:spacing w:after="0" w:line="245" w:lineRule="auto"/>
+            </w:pPr>
+            <w:r/>
+            <w:r>
+              <w:rPr>
+                <w:rFonts w:ascii="Arial" w:hAnsi="Arial"/>
+                <w:b/>
+                <w:color w:val="182B43"/>
+                <w:sz w:val="16"/>
+              </w:rPr>
+              <w:t>Students</w:t>
+            </w:r>
+          </w:p>
+        </w:tc>
+        <w:tc>
+          <w:tcPr>
+            <w:tcW w:type="dxa" w:w="6797"/>
+            <w:vAlign w:val="center"/>
+            <w:shd w:fill="EFF5FA"/>
+            <w:tcMar>
+              <w:top w:w="80" w:type="dxa"/>
+              <w:start w:w="100" w:type="dxa"/>
+              <w:bottom w:w="80" w:type="dxa"/>
+              <w:end w:w="100" w:type="dxa"/>
+            </w:tcMar>
+          </w:tcPr>
+          <w:p>
+            <w:pPr>
+              <w:spacing w:after="0" w:line="245" w:lineRule="auto"/>
+            </w:pPr>
+            <w:r/>
+            <w:r>
+              <w:rPr>
+                <w:rFonts w:ascii="Arial" w:hAnsi="Arial"/>
+                <w:b w:val="0"/>
+                <w:color w:val="182B43"/>
+                <w:sz w:val="16"/>
+              </w:rPr>
+              <w:t>Perfil, código, cédula, correo, carrera, universidad y estado del estudiante.</w:t>
+            </w:r>
+          </w:p>
+        </w:tc>
+      </w:tr>
+      <w:tr>
+        <w:tc>
+          <w:tcPr>
+            <w:tcW w:type="dxa" w:w="3096"/>
+            <w:vAlign w:val="center"/>
+            <w:shd w:fill="FFFFFF"/>
+            <w:tcMar>
+              <w:top w:w="80" w:type="dxa"/>
+              <w:start w:w="100" w:type="dxa"/>
+              <w:bottom w:w="80" w:type="dxa"/>
+              <w:end w:w="100" w:type="dxa"/>
+            </w:tcMar>
+          </w:tcPr>
+          <w:p>
+            <w:pPr>
+              <w:spacing w:after="0" w:line="245" w:lineRule="auto"/>
+            </w:pPr>
+            <w:r/>
+            <w:r>
+              <w:rPr>
+                <w:rFonts w:ascii="Arial" w:hAnsi="Arial"/>
+                <w:b/>
+                <w:color w:val="182B43"/>
+                <w:sz w:val="16"/>
+              </w:rPr>
+              <w:t>Scholarships</w:t>
+            </w:r>
+          </w:p>
+        </w:tc>
+        <w:tc>
+          <w:tcPr>
+            <w:tcW w:type="dxa" w:w="6797"/>
+            <w:vAlign w:val="center"/>
+            <w:shd w:fill="FFFFFF"/>
+            <w:tcMar>
+              <w:top w:w="80" w:type="dxa"/>
+              <w:start w:w="100" w:type="dxa"/>
+              <w:bottom w:w="80" w:type="dxa"/>
+              <w:end w:w="100" w:type="dxa"/>
+            </w:tcMar>
+          </w:tcPr>
+          <w:p>
+            <w:pPr>
+              <w:spacing w:after="0" w:line="245" w:lineRule="auto"/>
+            </w:pPr>
+            <w:r/>
+            <w:r>
+              <w:rPr>
+                <w:rFonts w:ascii="Arial" w:hAnsi="Arial"/>
+                <w:b w:val="0"/>
+                <w:color w:val="182B43"/>
+                <w:sz w:val="16"/>
+              </w:rPr>
+              <w:t>Convocatorias, montos, requisitos y fechas.</w:t>
+            </w:r>
+          </w:p>
+        </w:tc>
+      </w:tr>
+      <w:tr>
+        <w:tc>
+          <w:tcPr>
+            <w:tcW w:type="dxa" w:w="3096"/>
+            <w:vAlign w:val="center"/>
+            <w:shd w:fill="EFF5FA"/>
+            <w:tcMar>
+              <w:top w:w="80" w:type="dxa"/>
+              <w:start w:w="100" w:type="dxa"/>
+              <w:bottom w:w="80" w:type="dxa"/>
+              <w:end w:w="100" w:type="dxa"/>
+            </w:tcMar>
+          </w:tcPr>
+          <w:p>
+            <w:pPr>
+              <w:spacing w:after="0" w:line="245" w:lineRule="auto"/>
+            </w:pPr>
+            <w:r/>
+            <w:r>
+              <w:rPr>
+                <w:rFonts w:ascii="Arial" w:hAnsi="Arial"/>
+                <w:b/>
+                <w:color w:val="182B43"/>
+                <w:sz w:val="16"/>
+              </w:rPr>
+              <w:t>ScholarshipApplications</w:t>
+            </w:r>
+          </w:p>
+        </w:tc>
+        <w:tc>
+          <w:tcPr>
+            <w:tcW w:type="dxa" w:w="6797"/>
+            <w:vAlign w:val="center"/>
+            <w:shd w:fill="EFF5FA"/>
+            <w:tcMar>
+              <w:top w:w="80" w:type="dxa"/>
+              <w:start w:w="100" w:type="dxa"/>
+              <w:bottom w:w="80" w:type="dxa"/>
+              <w:end w:w="100" w:type="dxa"/>
+            </w:tcMar>
+          </w:tcPr>
+          <w:p>
+            <w:pPr>
+              <w:spacing w:after="0" w:line="245" w:lineRule="auto"/>
+            </w:pPr>
+            <w:r/>
+            <w:r>
+              <w:rPr>
+                <w:rFonts w:ascii="Arial" w:hAnsi="Arial"/>
+                <w:b w:val="0"/>
+                <w:color w:val="182B43"/>
+                <w:sz w:val="16"/>
+              </w:rPr>
+              <w:t>Solicitud de una persona para una convocatoria; estado, observación y documento opcional.</w:t>
+            </w:r>
+          </w:p>
+        </w:tc>
+      </w:tr>
+      <w:tr>
+        <w:tc>
+          <w:tcPr>
+            <w:tcW w:type="dxa" w:w="3096"/>
+            <w:vAlign w:val="center"/>
+            <w:shd w:fill="FFFFFF"/>
+            <w:tcMar>
+              <w:top w:w="80" w:type="dxa"/>
+              <w:start w:w="100" w:type="dxa"/>
+              <w:bottom w:w="80" w:type="dxa"/>
+              <w:end w:w="100" w:type="dxa"/>
+            </w:tcMar>
+          </w:tcPr>
+          <w:p>
+            <w:pPr>
+              <w:spacing w:after="0" w:line="245" w:lineRule="auto"/>
+            </w:pPr>
+            <w:r/>
+            <w:r>
+              <w:rPr>
+                <w:rFonts w:ascii="Arial" w:hAnsi="Arial"/>
+                <w:b/>
+                <w:color w:val="182B43"/>
+                <w:sz w:val="16"/>
+              </w:rPr>
+              <w:t>Payments</w:t>
+            </w:r>
+          </w:p>
+        </w:tc>
+        <w:tc>
+          <w:tcPr>
+            <w:tcW w:type="dxa" w:w="6797"/>
+            <w:vAlign w:val="center"/>
+            <w:shd w:fill="FFFFFF"/>
+            <w:tcMar>
+              <w:top w:w="80" w:type="dxa"/>
+              <w:start w:w="100" w:type="dxa"/>
+              <w:bottom w:w="80" w:type="dxa"/>
+              <w:end w:w="100" w:type="dxa"/>
+            </w:tcMar>
+          </w:tcPr>
+          <w:p>
+            <w:pPr>
+              <w:spacing w:after="0" w:line="245" w:lineRule="auto"/>
+            </w:pPr>
+            <w:r/>
+            <w:r>
+              <w:rPr>
+                <w:rFonts w:ascii="Arial" w:hAnsi="Arial"/>
+                <w:b w:val="0"/>
+                <w:color w:val="182B43"/>
+                <w:sz w:val="16"/>
+              </w:rPr>
+              <w:t>Depósitos registrados para solicitudes aceptadas; monto, fecha, período y estado.</w:t>
+            </w:r>
+          </w:p>
+        </w:tc>
+      </w:tr>
+      <w:tr>
+        <w:tc>
+          <w:tcPr>
+            <w:tcW w:type="dxa" w:w="3096"/>
+            <w:vAlign w:val="center"/>
+            <w:shd w:fill="EFF5FA"/>
+            <w:tcMar>
+              <w:top w:w="80" w:type="dxa"/>
+              <w:start w:w="100" w:type="dxa"/>
+              <w:bottom w:w="80" w:type="dxa"/>
+              <w:end w:w="100" w:type="dxa"/>
+            </w:tcMar>
+          </w:tcPr>
+          <w:p>
+            <w:pPr>
+              <w:spacing w:after="0" w:line="245" w:lineRule="auto"/>
+            </w:pPr>
+            <w:r/>
+            <w:r>
+              <w:rPr>
+                <w:rFonts w:ascii="Arial" w:hAnsi="Arial"/>
+                <w:b/>
+                <w:color w:val="182B43"/>
+                <w:sz w:val="16"/>
+              </w:rPr>
+              <w:t>Publications</w:t>
+            </w:r>
+          </w:p>
+        </w:tc>
+        <w:tc>
+          <w:tcPr>
+            <w:tcW w:type="dxa" w:w="6797"/>
+            <w:vAlign w:val="center"/>
+            <w:shd w:fill="EFF5FA"/>
+            <w:tcMar>
+              <w:top w:w="80" w:type="dxa"/>
+              <w:start w:w="100" w:type="dxa"/>
+              <w:bottom w:w="80" w:type="dxa"/>
+              <w:end w:w="100" w:type="dxa"/>
+            </w:tcMar>
+          </w:tcPr>
+          <w:p>
+            <w:pPr>
+              <w:spacing w:after="0" w:line="245" w:lineRule="auto"/>
+            </w:pPr>
+            <w:r/>
+            <w:r>
+              <w:rPr>
+                <w:rFonts w:ascii="Arial" w:hAnsi="Arial"/>
+                <w:b w:val="0"/>
+                <w:color w:val="182B43"/>
+                <w:sz w:val="16"/>
+              </w:rPr>
+              <w:t>Noticias, eventos y avisos publicados por el equipo administrativo.</w:t>
+            </w:r>
+          </w:p>
+        </w:tc>
+      </w:tr>
+      <w:tr>
+        <w:tc>
+          <w:tcPr>
+            <w:tcW w:type="dxa" w:w="3096"/>
+            <w:vAlign w:val="center"/>
+            <w:shd w:fill="FFFFFF"/>
+            <w:tcMar>
+              <w:top w:w="80" w:type="dxa"/>
+              <w:start w:w="100" w:type="dxa"/>
+              <w:bottom w:w="80" w:type="dxa"/>
+              <w:end w:w="100" w:type="dxa"/>
+            </w:tcMar>
+          </w:tcPr>
+          <w:p>
+            <w:pPr>
+              <w:spacing w:after="0" w:line="245" w:lineRule="auto"/>
+            </w:pPr>
+            <w:r/>
+            <w:r>
+              <w:rPr>
+                <w:rFonts w:ascii="Arial" w:hAnsi="Arial"/>
+                <w:b/>
+                <w:color w:val="182B43"/>
+                <w:sz w:val="16"/>
+              </w:rPr>
+              <w:t>Notifications</w:t>
+            </w:r>
+          </w:p>
+        </w:tc>
+        <w:tc>
+          <w:tcPr>
+            <w:tcW w:type="dxa" w:w="6797"/>
+            <w:vAlign w:val="center"/>
+            <w:shd w:fill="FFFFFF"/>
+            <w:tcMar>
+              <w:top w:w="80" w:type="dxa"/>
+              <w:start w:w="100" w:type="dxa"/>
+              <w:bottom w:w="80" w:type="dxa"/>
+              <w:end w:w="100" w:type="dxa"/>
+            </w:tcMar>
+          </w:tcPr>
+          <w:p>
+            <w:pPr>
+              <w:spacing w:after="0" w:line="245" w:lineRule="auto"/>
+            </w:pPr>
+            <w:r/>
+            <w:r>
+              <w:rPr>
+                <w:rFonts w:ascii="Arial" w:hAnsi="Arial"/>
+                <w:b w:val="0"/>
+                <w:color w:val="182B43"/>
+                <w:sz w:val="16"/>
+              </w:rPr>
+              <w:t>Avisos destinados a un estudiante y su estado de lectura.</w:t>
+            </w:r>
+          </w:p>
+        </w:tc>
+      </w:tr>
+      <w:tr>
+        <w:tc>
+          <w:tcPr>
+            <w:tcW w:type="dxa" w:w="3096"/>
+            <w:vAlign w:val="center"/>
+            <w:shd w:fill="EFF5FA"/>
+            <w:tcMar>
+              <w:top w:w="80" w:type="dxa"/>
+              <w:start w:w="100" w:type="dxa"/>
+              <w:bottom w:w="80" w:type="dxa"/>
+              <w:end w:w="100" w:type="dxa"/>
+            </w:tcMar>
+          </w:tcPr>
+          <w:p>
+            <w:pPr>
+              <w:spacing w:after="0" w:line="245" w:lineRule="auto"/>
+            </w:pPr>
+            <w:r/>
+            <w:r>
+              <w:rPr>
+                <w:rFonts w:ascii="Arial" w:hAnsi="Arial"/>
+                <w:b/>
+                <w:color w:val="182B43"/>
+                <w:sz w:val="16"/>
+              </w:rPr>
+              <w:t>AspNetUsers / AspNetRoles</w:t>
+            </w:r>
+          </w:p>
+        </w:tc>
+        <w:tc>
+          <w:tcPr>
+            <w:tcW w:type="dxa" w:w="6797"/>
+            <w:vAlign w:val="center"/>
+            <w:shd w:fill="EFF5FA"/>
+            <w:tcMar>
+              <w:top w:w="80" w:type="dxa"/>
+              <w:start w:w="100" w:type="dxa"/>
+              <w:bottom w:w="80" w:type="dxa"/>
+              <w:end w:w="100" w:type="dxa"/>
+            </w:tcMar>
+          </w:tcPr>
+          <w:p>
+            <w:pPr>
+              <w:spacing w:after="0" w:line="245" w:lineRule="auto"/>
+            </w:pPr>
+            <w:r/>
+            <w:r>
+              <w:rPr>
+                <w:rFonts w:ascii="Arial" w:hAnsi="Arial"/>
+                <w:b w:val="0"/>
+                <w:color w:val="182B43"/>
+                <w:sz w:val="16"/>
+              </w:rPr>
+              <w:t>Cuentas, contraseñas protegidas y roles Admin/Student.</w:t>
+            </w:r>
+          </w:p>
+        </w:tc>
+      </w:tr>
+    </w:tbl>
+    <w:p>
+      <w:pPr>
+        <w:pStyle w:val="ListBullet"/>
+        <w:widowControl/>
+        <w:spacing w:after="40"/>
+        <w:ind w:left="360" w:hanging="173"/>
+      </w:pPr>
+      <w:r>
+        <w:rPr>
+          <w:rFonts w:ascii="Arial" w:hAnsi="Arial"/>
+          <w:b w:val="0"/>
+          <w:color w:val="182B43"/>
+          <w:sz w:val="18"/>
+        </w:rPr>
+        <w:t>Cada solicitud relaciona un estudiante con una beca. Un índice único evita repetir la misma solicitud para la misma convocatoria.</w:t>
+      </w:r>
+    </w:p>
+    <w:p>
+      <w:pPr>
+        <w:pStyle w:val="ListBullet"/>
+        <w:widowControl/>
+        <w:spacing w:after="40"/>
+        <w:ind w:left="360" w:hanging="173"/>
+      </w:pPr>
+      <w:r>
+        <w:rPr>
+          <w:rFonts w:ascii="Arial" w:hAnsi="Arial"/>
+          <w:b w:val="0"/>
+          <w:color w:val="182B43"/>
+          <w:sz w:val="18"/>
+        </w:rPr>
+        <w:t>Los pagos se relacionan con una solicitud aceptada; las claves foráneas protegen la información vinculada.</w:t>
+      </w:r>
+    </w:p>
+    <w:p>
+      <w:pPr>
+        <w:pStyle w:val="ListBullet"/>
+        <w:widowControl/>
+        <w:spacing w:after="40"/>
+        <w:ind w:left="360" w:hanging="173"/>
+      </w:pPr>
+      <w:r>
+        <w:rPr>
+          <w:rFonts w:ascii="Arial" w:hAnsi="Arial"/>
+          <w:b w:val="0"/>
+          <w:color w:val="182B43"/>
+          <w:sz w:val="18"/>
+        </w:rPr>
+        <w:t>La cuenta Student queda asociada a un solo expediente. Las páginas del portal filtran los datos por la cuenta que inició sesión.</w:t>
+      </w:r>
+    </w:p>
+    <w:p>
+      <w:pPr>
+        <w:pStyle w:val="Heading1"/>
+      </w:pPr>
+      <w:r>
+        <w:t>4. Flujo principal de información</w:t>
+      </w:r>
+    </w:p>
+    <w:tbl>
+      <w:tblPr>
+        <w:tblStyle w:val="TableGrid"/>
+        <w:tblW w:type="auto" w:w="0"/>
+        <w:jc w:val="center"/>
+        <w:tblLayout w:type="fixed"/>
+        <w:tblLook w:firstColumn="1" w:firstRow="1" w:lastColumn="0" w:lastRow="0" w:noHBand="0" w:noVBand="1" w:val="04A0"/>
+      </w:tblPr>
+      <w:tblGrid>
+        <w:gridCol w:w="792"/>
+        <w:gridCol w:w="9101"/>
+      </w:tblGrid>
+      <w:tr>
+        <w:trPr>
+          <w:tblHeader w:val="true"/>
+        </w:trPr>
+        <w:tc>
+          <w:tcPr>
+            <w:tcW w:type="dxa" w:w="792"/>
+            <w:vAlign w:val="center"/>
+            <w:shd w:fill="092754"/>
+            <w:tcMar>
+              <w:top w:w="80" w:type="dxa"/>
+              <w:start w:w="100" w:type="dxa"/>
+              <w:bottom w:w="80" w:type="dxa"/>
+              <w:end w:w="100" w:type="dxa"/>
+            </w:tcMar>
+          </w:tcPr>
+          <w:p>
+            <w:pPr>
+              <w:spacing w:after="0" w:line="245" w:lineRule="auto"/>
+            </w:pPr>
+            <w:r/>
+            <w:r>
+              <w:rPr>
+                <w:rFonts w:ascii="Arial" w:hAnsi="Arial"/>
+                <w:b/>
+                <w:color w:val="FFFFFF"/>
+                <w:sz w:val="16"/>
+              </w:rPr>
+              <w:t>Paso</w:t>
+            </w:r>
+          </w:p>
+        </w:tc>
+        <w:tc>
+          <w:tcPr>
+            <w:tcW w:type="dxa" w:w="9101"/>
+            <w:vAlign w:val="center"/>
+            <w:shd w:fill="092754"/>
+            <w:tcMar>
+              <w:top w:w="80" w:type="dxa"/>
+              <w:start w:w="100" w:type="dxa"/>
+              <w:bottom w:w="80" w:type="dxa"/>
+              <w:end w:w="100" w:type="dxa"/>
+            </w:tcMar>
+          </w:tcPr>
+          <w:p>
+            <w:pPr>
+              <w:spacing w:after="0" w:line="245" w:lineRule="auto"/>
+            </w:pPr>
+            <w:r/>
+            <w:r>
+              <w:rPr>
+                <w:rFonts w:ascii="Arial" w:hAnsi="Arial"/>
+                <w:b/>
+                <w:color w:val="FFFFFF"/>
+                <w:sz w:val="16"/>
+              </w:rPr>
+              <w:t>Qué ocurre</w:t>
+            </w:r>
+          </w:p>
+        </w:tc>
+      </w:tr>
+      <w:tr>
+        <w:tc>
+          <w:tcPr>
+            <w:tcW w:type="dxa" w:w="792"/>
+            <w:vAlign w:val="center"/>
+            <w:shd w:fill="EFF5FA"/>
+            <w:tcMar>
+              <w:top w:w="80" w:type="dxa"/>
+              <w:start w:w="100" w:type="dxa"/>
+              <w:bottom w:w="80" w:type="dxa"/>
+              <w:end w:w="100" w:type="dxa"/>
+            </w:tcMar>
+          </w:tcPr>
+          <w:p>
+            <w:pPr>
+              <w:spacing w:after="0" w:line="245" w:lineRule="auto"/>
+            </w:pPr>
+            <w:r/>
+            <w:r>
+              <w:rPr>
+                <w:rFonts w:ascii="Arial" w:hAnsi="Arial"/>
+                <w:b/>
+                <w:color w:val="182B43"/>
+                <w:sz w:val="16"/>
+              </w:rPr>
+              <w:t>1</w:t>
+            </w:r>
+          </w:p>
+        </w:tc>
+        <w:tc>
+          <w:tcPr>
+            <w:tcW w:type="dxa" w:w="9101"/>
+            <w:vAlign w:val="center"/>
+            <w:shd w:fill="EFF5FA"/>
+            <w:tcMar>
+              <w:top w:w="80" w:type="dxa"/>
+              <w:start w:w="100" w:type="dxa"/>
+              <w:bottom w:w="80" w:type="dxa"/>
+              <w:end w:w="100" w:type="dxa"/>
+            </w:tcMar>
+          </w:tcPr>
+          <w:p>
+            <w:pPr>
+              <w:spacing w:after="0" w:line="245" w:lineRule="auto"/>
+            </w:pPr>
+            <w:r/>
+            <w:r>
+              <w:rPr>
+                <w:rFonts w:ascii="Arial" w:hAnsi="Arial"/>
+                <w:b w:val="0"/>
+                <w:color w:val="182B43"/>
+                <w:sz w:val="16"/>
+              </w:rPr>
+              <w:t>La persona completa el registro público con datos personales y correo.</w:t>
+            </w:r>
+          </w:p>
+        </w:tc>
+      </w:tr>
+      <w:tr>
+        <w:tc>
+          <w:tcPr>
+            <w:tcW w:type="dxa" w:w="792"/>
+            <w:vAlign w:val="center"/>
+            <w:shd w:fill="FFFFFF"/>
+            <w:tcMar>
+              <w:top w:w="80" w:type="dxa"/>
+              <w:start w:w="100" w:type="dxa"/>
+              <w:bottom w:w="80" w:type="dxa"/>
+              <w:end w:w="100" w:type="dxa"/>
+            </w:tcMar>
+          </w:tcPr>
+          <w:p>
+            <w:pPr>
+              <w:spacing w:after="0" w:line="245" w:lineRule="auto"/>
+            </w:pPr>
+            <w:r/>
+            <w:r>
+              <w:rPr>
+                <w:rFonts w:ascii="Arial" w:hAnsi="Arial"/>
+                <w:b/>
+                <w:color w:val="182B43"/>
+                <w:sz w:val="16"/>
+              </w:rPr>
+              <w:t>2</w:t>
+            </w:r>
+          </w:p>
+        </w:tc>
+        <w:tc>
+          <w:tcPr>
+            <w:tcW w:type="dxa" w:w="9101"/>
+            <w:vAlign w:val="center"/>
+            <w:shd w:fill="FFFFFF"/>
+            <w:tcMar>
+              <w:top w:w="80" w:type="dxa"/>
+              <w:start w:w="100" w:type="dxa"/>
+              <w:bottom w:w="80" w:type="dxa"/>
+              <w:end w:w="100" w:type="dxa"/>
+            </w:tcMar>
+          </w:tcPr>
+          <w:p>
+            <w:pPr>
+              <w:spacing w:after="0" w:line="245" w:lineRule="auto"/>
+            </w:pPr>
+            <w:r/>
+            <w:r>
+              <w:rPr>
+                <w:rFonts w:ascii="Arial" w:hAnsi="Arial"/>
+                <w:b w:val="0"/>
+                <w:color w:val="182B43"/>
+                <w:sz w:val="16"/>
+              </w:rPr>
+              <w:t>NBU guarda el estudiante y la cuenta con estado pendiente; todavía no permite entrar al portal.</w:t>
+            </w:r>
+          </w:p>
+        </w:tc>
+      </w:tr>
+      <w:tr>
+        <w:tc>
+          <w:tcPr>
+            <w:tcW w:type="dxa" w:w="792"/>
+            <w:vAlign w:val="center"/>
+            <w:shd w:fill="EFF5FA"/>
+            <w:tcMar>
+              <w:top w:w="80" w:type="dxa"/>
+              <w:start w:w="100" w:type="dxa"/>
+              <w:bottom w:w="80" w:type="dxa"/>
+              <w:end w:w="100" w:type="dxa"/>
+            </w:tcMar>
+          </w:tcPr>
+          <w:p>
+            <w:pPr>
+              <w:spacing w:after="0" w:line="245" w:lineRule="auto"/>
+            </w:pPr>
+            <w:r/>
+            <w:r>
+              <w:rPr>
+                <w:rFonts w:ascii="Arial" w:hAnsi="Arial"/>
+                <w:b/>
+                <w:color w:val="182B43"/>
+                <w:sz w:val="16"/>
+              </w:rPr>
+              <w:t>3</w:t>
+            </w:r>
+          </w:p>
+        </w:tc>
+        <w:tc>
+          <w:tcPr>
+            <w:tcW w:type="dxa" w:w="9101"/>
+            <w:vAlign w:val="center"/>
+            <w:shd w:fill="EFF5FA"/>
+            <w:tcMar>
+              <w:top w:w="80" w:type="dxa"/>
+              <w:start w:w="100" w:type="dxa"/>
+              <w:bottom w:w="80" w:type="dxa"/>
+              <w:end w:w="100" w:type="dxa"/>
+            </w:tcMar>
+          </w:tcPr>
+          <w:p>
+            <w:pPr>
+              <w:spacing w:after="0" w:line="245" w:lineRule="auto"/>
+            </w:pPr>
+            <w:r/>
+            <w:r>
+              <w:rPr>
+                <w:rFonts w:ascii="Arial" w:hAnsi="Arial"/>
+                <w:b w:val="0"/>
+                <w:color w:val="182B43"/>
+                <w:sz w:val="16"/>
+              </w:rPr>
+              <w:t>Administración revisa la bandeja Registros pendientes y acepta o rechaza. El rechazo necesita un motivo.</w:t>
+            </w:r>
+          </w:p>
+        </w:tc>
+      </w:tr>
+      <w:tr>
+        <w:tc>
+          <w:tcPr>
+            <w:tcW w:type="dxa" w:w="792"/>
+            <w:vAlign w:val="center"/>
+            <w:shd w:fill="FFFFFF"/>
+            <w:tcMar>
+              <w:top w:w="80" w:type="dxa"/>
+              <w:start w:w="100" w:type="dxa"/>
+              <w:bottom w:w="80" w:type="dxa"/>
+              <w:end w:w="100" w:type="dxa"/>
+            </w:tcMar>
+          </w:tcPr>
+          <w:p>
+            <w:pPr>
+              <w:spacing w:after="0" w:line="245" w:lineRule="auto"/>
+            </w:pPr>
+            <w:r/>
+            <w:r>
+              <w:rPr>
+                <w:rFonts w:ascii="Arial" w:hAnsi="Arial"/>
+                <w:b/>
+                <w:color w:val="182B43"/>
+                <w:sz w:val="16"/>
+              </w:rPr>
+              <w:t>4</w:t>
+            </w:r>
+          </w:p>
+        </w:tc>
+        <w:tc>
+          <w:tcPr>
+            <w:tcW w:type="dxa" w:w="9101"/>
+            <w:vAlign w:val="center"/>
+            <w:shd w:fill="FFFFFF"/>
+            <w:tcMar>
+              <w:top w:w="80" w:type="dxa"/>
+              <w:start w:w="100" w:type="dxa"/>
+              <w:bottom w:w="80" w:type="dxa"/>
+              <w:end w:w="100" w:type="dxa"/>
+            </w:tcMar>
+          </w:tcPr>
+          <w:p>
+            <w:pPr>
+              <w:spacing w:after="0" w:line="245" w:lineRule="auto"/>
+            </w:pPr>
+            <w:r/>
+            <w:r>
+              <w:rPr>
+                <w:rFonts w:ascii="Arial" w:hAnsi="Arial"/>
+                <w:b w:val="0"/>
+                <w:color w:val="182B43"/>
+                <w:sz w:val="16"/>
+              </w:rPr>
+              <w:t>Después de aceptar, la persona inicia sesión, ve las becas y envía una solicitud.</w:t>
+            </w:r>
+          </w:p>
+        </w:tc>
+      </w:tr>
+      <w:tr>
+        <w:tc>
+          <w:tcPr>
+            <w:tcW w:type="dxa" w:w="792"/>
+            <w:vAlign w:val="center"/>
+            <w:shd w:fill="EFF5FA"/>
+            <w:tcMar>
+              <w:top w:w="80" w:type="dxa"/>
+              <w:start w:w="100" w:type="dxa"/>
+              <w:bottom w:w="80" w:type="dxa"/>
+              <w:end w:w="100" w:type="dxa"/>
+            </w:tcMar>
+          </w:tcPr>
+          <w:p>
+            <w:pPr>
+              <w:spacing w:after="0" w:line="245" w:lineRule="auto"/>
+            </w:pPr>
+            <w:r/>
+            <w:r>
+              <w:rPr>
+                <w:rFonts w:ascii="Arial" w:hAnsi="Arial"/>
+                <w:b/>
+                <w:color w:val="182B43"/>
+                <w:sz w:val="16"/>
+              </w:rPr>
+              <w:t>5</w:t>
+            </w:r>
+          </w:p>
+        </w:tc>
+        <w:tc>
+          <w:tcPr>
+            <w:tcW w:type="dxa" w:w="9101"/>
+            <w:vAlign w:val="center"/>
+            <w:shd w:fill="EFF5FA"/>
+            <w:tcMar>
+              <w:top w:w="80" w:type="dxa"/>
+              <w:start w:w="100" w:type="dxa"/>
+              <w:bottom w:w="80" w:type="dxa"/>
+              <w:end w:w="100" w:type="dxa"/>
+            </w:tcMar>
+          </w:tcPr>
+          <w:p>
+            <w:pPr>
+              <w:spacing w:after="0" w:line="245" w:lineRule="auto"/>
+            </w:pPr>
+            <w:r/>
+            <w:r>
+              <w:rPr>
+                <w:rFonts w:ascii="Arial" w:hAnsi="Arial"/>
+                <w:b w:val="0"/>
+                <w:color w:val="182B43"/>
+                <w:sz w:val="16"/>
+              </w:rPr>
+              <w:t>Personal registra el resultado de la solicitud y los depósitos externos que ya ocurrieron.</w:t>
+            </w:r>
+          </w:p>
+        </w:tc>
+      </w:tr>
+      <w:tr>
+        <w:tc>
+          <w:tcPr>
+            <w:tcW w:type="dxa" w:w="792"/>
+            <w:vAlign w:val="center"/>
+            <w:shd w:fill="FFFFFF"/>
+            <w:tcMar>
+              <w:top w:w="80" w:type="dxa"/>
+              <w:start w:w="100" w:type="dxa"/>
+              <w:bottom w:w="80" w:type="dxa"/>
+              <w:end w:w="100" w:type="dxa"/>
+            </w:tcMar>
+          </w:tcPr>
+          <w:p>
+            <w:pPr>
+              <w:spacing w:after="0" w:line="245" w:lineRule="auto"/>
+            </w:pPr>
+            <w:r/>
+            <w:r>
+              <w:rPr>
+                <w:rFonts w:ascii="Arial" w:hAnsi="Arial"/>
+                <w:b/>
+                <w:color w:val="182B43"/>
+                <w:sz w:val="16"/>
+              </w:rPr>
+              <w:t>6</w:t>
+            </w:r>
+          </w:p>
+        </w:tc>
+        <w:tc>
+          <w:tcPr>
+            <w:tcW w:type="dxa" w:w="9101"/>
+            <w:vAlign w:val="center"/>
+            <w:shd w:fill="FFFFFF"/>
+            <w:tcMar>
+              <w:top w:w="80" w:type="dxa"/>
+              <w:start w:w="100" w:type="dxa"/>
+              <w:bottom w:w="80" w:type="dxa"/>
+              <w:end w:w="100" w:type="dxa"/>
+            </w:tcMar>
+          </w:tcPr>
+          <w:p>
+            <w:pPr>
+              <w:spacing w:after="0" w:line="245" w:lineRule="auto"/>
+            </w:pPr>
+            <w:r/>
+            <w:r>
+              <w:rPr>
+                <w:rFonts w:ascii="Arial" w:hAnsi="Arial"/>
+                <w:b w:val="0"/>
+                <w:color w:val="182B43"/>
+                <w:sz w:val="16"/>
+              </w:rPr>
+              <w:t>El estudiante consulta sus propios estados, pagos, noticias y notificaciones en el portal.</w:t>
+            </w:r>
+          </w:p>
+        </w:tc>
+      </w:tr>
+    </w:tbl>
+    <w:p>
+      <w:r>
+        <w:br w:type="page"/>
+      </w:r>
+    </w:p>
+    <w:p>
+      <w:pPr>
+        <w:pStyle w:val="Heading1"/>
+      </w:pPr>
+      <w:r>
+        <w:t>5. Perfiles, validación y seguridad</w:t>
+      </w:r>
+    </w:p>
+    <w:tbl>
+      <w:tblPr>
+        <w:tblStyle w:val="TableGrid"/>
+        <w:tblW w:type="auto" w:w="0"/>
+        <w:jc w:val="center"/>
+        <w:tblLayout w:type="fixed"/>
+        <w:tblLook w:firstColumn="1" w:firstRow="1" w:lastColumn="0" w:lastRow="0" w:noHBand="0" w:noVBand="1" w:val="04A0"/>
+      </w:tblPr>
+      <w:tblGrid>
+        <w:gridCol w:w="1872"/>
+        <w:gridCol w:w="8021"/>
+      </w:tblGrid>
+      <w:tr>
+        <w:trPr>
+          <w:tblHeader w:val="true"/>
+        </w:trPr>
+        <w:tc>
+          <w:tcPr>
+            <w:tcW w:type="dxa" w:w="1872"/>
+            <w:vAlign w:val="center"/>
+            <w:shd w:fill="092754"/>
+            <w:tcMar>
+              <w:top w:w="80" w:type="dxa"/>
+              <w:start w:w="100" w:type="dxa"/>
+              <w:bottom w:w="80" w:type="dxa"/>
+              <w:end w:w="100" w:type="dxa"/>
+            </w:tcMar>
+          </w:tcPr>
+          <w:p>
+            <w:pPr>
+              <w:spacing w:after="0" w:line="245" w:lineRule="auto"/>
+            </w:pPr>
+            <w:r/>
+            <w:r>
+              <w:rPr>
+                <w:rFonts w:ascii="Arial" w:hAnsi="Arial"/>
+                <w:b/>
+                <w:color w:val="FFFFFF"/>
+                <w:sz w:val="16"/>
+              </w:rPr>
+              <w:t>Perfil</w:t>
+            </w:r>
+          </w:p>
+        </w:tc>
+        <w:tc>
+          <w:tcPr>
+            <w:tcW w:type="dxa" w:w="8021"/>
+            <w:vAlign w:val="center"/>
+            <w:shd w:fill="092754"/>
+            <w:tcMar>
+              <w:top w:w="80" w:type="dxa"/>
+              <w:start w:w="100" w:type="dxa"/>
+              <w:bottom w:w="80" w:type="dxa"/>
+              <w:end w:w="100" w:type="dxa"/>
+            </w:tcMar>
+          </w:tcPr>
+          <w:p>
+            <w:pPr>
+              <w:spacing w:after="0" w:line="245" w:lineRule="auto"/>
+            </w:pPr>
+            <w:r/>
+            <w:r>
+              <w:rPr>
+                <w:rFonts w:ascii="Arial" w:hAnsi="Arial"/>
+                <w:b/>
+                <w:color w:val="FFFFFF"/>
+                <w:sz w:val="16"/>
+              </w:rPr>
+              <w:t>Permisos principales</w:t>
+            </w:r>
+          </w:p>
+        </w:tc>
+      </w:tr>
+      <w:tr>
+        <w:tc>
+          <w:tcPr>
+            <w:tcW w:type="dxa" w:w="1872"/>
+            <w:vAlign w:val="center"/>
+            <w:shd w:fill="EFF5FA"/>
+            <w:tcMar>
+              <w:top w:w="80" w:type="dxa"/>
+              <w:start w:w="100" w:type="dxa"/>
+              <w:bottom w:w="80" w:type="dxa"/>
+              <w:end w:w="100" w:type="dxa"/>
+            </w:tcMar>
+          </w:tcPr>
+          <w:p>
+            <w:pPr>
+              <w:spacing w:after="0" w:line="245" w:lineRule="auto"/>
+            </w:pPr>
+            <w:r/>
+            <w:r>
+              <w:rPr>
+                <w:rFonts w:ascii="Arial" w:hAnsi="Arial"/>
+                <w:b/>
+                <w:color w:val="182B43"/>
+                <w:sz w:val="16"/>
+              </w:rPr>
+              <w:t>Admin</w:t>
+            </w:r>
+          </w:p>
+        </w:tc>
+        <w:tc>
+          <w:tcPr>
+            <w:tcW w:type="dxa" w:w="8021"/>
+            <w:vAlign w:val="center"/>
+            <w:shd w:fill="EFF5FA"/>
+            <w:tcMar>
+              <w:top w:w="80" w:type="dxa"/>
+              <w:start w:w="100" w:type="dxa"/>
+              <w:bottom w:w="80" w:type="dxa"/>
+              <w:end w:w="100" w:type="dxa"/>
+            </w:tcMar>
+          </w:tcPr>
+          <w:p>
+            <w:pPr>
+              <w:spacing w:after="0" w:line="245" w:lineRule="auto"/>
+            </w:pPr>
+            <w:r/>
+            <w:r>
+              <w:rPr>
+                <w:rFonts w:ascii="Arial" w:hAnsi="Arial"/>
+                <w:b w:val="0"/>
+                <w:color w:val="182B43"/>
+                <w:sz w:val="16"/>
+              </w:rPr>
+              <w:t>Administra módulos en web y escritorio; revisa los registros pendientes.</w:t>
+            </w:r>
+          </w:p>
+        </w:tc>
+      </w:tr>
+      <w:tr>
+        <w:tc>
+          <w:tcPr>
+            <w:tcW w:type="dxa" w:w="1872"/>
+            <w:vAlign w:val="center"/>
+            <w:shd w:fill="FFFFFF"/>
+            <w:tcMar>
+              <w:top w:w="80" w:type="dxa"/>
+              <w:start w:w="100" w:type="dxa"/>
+              <w:bottom w:w="80" w:type="dxa"/>
+              <w:end w:w="100" w:type="dxa"/>
+            </w:tcMar>
+          </w:tcPr>
+          <w:p>
+            <w:pPr>
+              <w:spacing w:after="0" w:line="245" w:lineRule="auto"/>
             </w:pPr>
             <w:r/>
             <w:r>
@@ -1000,19 +2131,19 @@
         </w:tc>
         <w:tc>
           <w:tcPr>
-            <w:tcW w:type="dxa" w:w="7848"/>
+            <w:tcW w:type="dxa" w:w="8021"/>
             <w:vAlign w:val="center"/>
-            <w:shd w:fill="EFF5FA"/>
+            <w:shd w:fill="FFFFFF"/>
             <w:tcMar>
-              <w:top w:w="95" w:type="dxa"/>
-              <w:start w:w="115" w:type="dxa"/>
-              <w:bottom w:w="95" w:type="dxa"/>
-              <w:end w:w="115" w:type="dxa"/>
+              <w:top w:w="80" w:type="dxa"/>
+              <w:start w:w="100" w:type="dxa"/>
+              <w:bottom w:w="80" w:type="dxa"/>
+              <w:end w:w="100" w:type="dxa"/>
             </w:tcMar>
           </w:tcPr>
           <w:p>
             <w:pPr>
-              <w:spacing w:after="0" w:line="240" w:lineRule="auto"/>
+              <w:spacing w:after="0" w:line="245" w:lineRule="auto"/>
             </w:pPr>
             <w:r/>
             <w:r>
@@ -1022,355 +2153,7 @@
                 <w:color w:val="182B43"/>
                 <w:sz w:val="16"/>
               </w:rPr>
-              <w:t>Código, nombres, apellidos, cédula, correo, teléfono, carrera, universidad y estado.</w:t>
-            </w:r>
-          </w:p>
-        </w:tc>
-      </w:tr>
-      <w:tr>
-        <w:tc>
-          <w:tcPr>
-            <w:tcW w:type="dxa" w:w="2664"/>
-            <w:vAlign w:val="center"/>
-            <w:shd w:fill="FFFFFF"/>
-            <w:tcMar>
-              <w:top w:w="95" w:type="dxa"/>
-              <w:start w:w="115" w:type="dxa"/>
-              <w:bottom w:w="95" w:type="dxa"/>
-              <w:end w:w="115" w:type="dxa"/>
-            </w:tcMar>
-          </w:tcPr>
-          <w:p>
-            <w:pPr>
-              <w:spacing w:after="0" w:line="240" w:lineRule="auto"/>
-            </w:pPr>
-            <w:r/>
-            <w:r>
-              <w:rPr>
-                <w:rFonts w:ascii="Arial" w:hAnsi="Arial"/>
-                <w:b/>
-                <w:color w:val="182B43"/>
-                <w:sz w:val="16"/>
-              </w:rPr>
-              <w:t>Scholarship</w:t>
-            </w:r>
-          </w:p>
-        </w:tc>
-        <w:tc>
-          <w:tcPr>
-            <w:tcW w:type="dxa" w:w="7848"/>
-            <w:vAlign w:val="center"/>
-            <w:shd w:fill="FFFFFF"/>
-            <w:tcMar>
-              <w:top w:w="95" w:type="dxa"/>
-              <w:start w:w="115" w:type="dxa"/>
-              <w:bottom w:w="95" w:type="dxa"/>
-              <w:end w:w="115" w:type="dxa"/>
-            </w:tcMar>
-          </w:tcPr>
-          <w:p>
-            <w:pPr>
-              <w:spacing w:after="0" w:line="240" w:lineRule="auto"/>
-            </w:pPr>
-            <w:r/>
-            <w:r>
-              <w:rPr>
-                <w:rFonts w:ascii="Arial" w:hAnsi="Arial"/>
-                <w:b w:val="0"/>
-                <w:color w:val="182B43"/>
-                <w:sz w:val="16"/>
-              </w:rPr>
-              <w:t>Nombre, descripción, requisitos, monto y fechas de convocatoria.</w:t>
-            </w:r>
-          </w:p>
-        </w:tc>
-      </w:tr>
-      <w:tr>
-        <w:tc>
-          <w:tcPr>
-            <w:tcW w:type="dxa" w:w="2664"/>
-            <w:vAlign w:val="center"/>
-            <w:shd w:fill="EFF5FA"/>
-            <w:tcMar>
-              <w:top w:w="95" w:type="dxa"/>
-              <w:start w:w="115" w:type="dxa"/>
-              <w:bottom w:w="95" w:type="dxa"/>
-              <w:end w:w="115" w:type="dxa"/>
-            </w:tcMar>
-          </w:tcPr>
-          <w:p>
-            <w:pPr>
-              <w:spacing w:after="0" w:line="240" w:lineRule="auto"/>
-            </w:pPr>
-            <w:r/>
-            <w:r>
-              <w:rPr>
-                <w:rFonts w:ascii="Arial" w:hAnsi="Arial"/>
-                <w:b/>
-                <w:color w:val="182B43"/>
-                <w:sz w:val="16"/>
-              </w:rPr>
-              <w:t>ScholarshipApplication</w:t>
-            </w:r>
-          </w:p>
-        </w:tc>
-        <w:tc>
-          <w:tcPr>
-            <w:tcW w:type="dxa" w:w="7848"/>
-            <w:vAlign w:val="center"/>
-            <w:shd w:fill="EFF5FA"/>
-            <w:tcMar>
-              <w:top w:w="95" w:type="dxa"/>
-              <w:start w:w="115" w:type="dxa"/>
-              <w:bottom w:w="95" w:type="dxa"/>
-              <w:end w:w="115" w:type="dxa"/>
-            </w:tcMar>
-          </w:tcPr>
-          <w:p>
-            <w:pPr>
-              <w:spacing w:after="0" w:line="240" w:lineRule="auto"/>
-            </w:pPr>
-            <w:r/>
-            <w:r>
-              <w:rPr>
-                <w:rFonts w:ascii="Arial" w:hAnsi="Arial"/>
-                <w:b w:val="0"/>
-                <w:color w:val="182B43"/>
-                <w:sz w:val="16"/>
-              </w:rPr>
-              <w:t>Relaciona estudiante y beca; conserva fecha, estado y observaciones.</w:t>
-            </w:r>
-          </w:p>
-        </w:tc>
-      </w:tr>
-      <w:tr>
-        <w:tc>
-          <w:tcPr>
-            <w:tcW w:type="dxa" w:w="2664"/>
-            <w:vAlign w:val="center"/>
-            <w:shd w:fill="FFFFFF"/>
-            <w:tcMar>
-              <w:top w:w="95" w:type="dxa"/>
-              <w:start w:w="115" w:type="dxa"/>
-              <w:bottom w:w="95" w:type="dxa"/>
-              <w:end w:w="115" w:type="dxa"/>
-            </w:tcMar>
-          </w:tcPr>
-          <w:p>
-            <w:pPr>
-              <w:spacing w:after="0" w:line="240" w:lineRule="auto"/>
-            </w:pPr>
-            <w:r/>
-            <w:r>
-              <w:rPr>
-                <w:rFonts w:ascii="Arial" w:hAnsi="Arial"/>
-                <w:b/>
-                <w:color w:val="182B43"/>
-                <w:sz w:val="16"/>
-              </w:rPr>
-              <w:t>Payment</w:t>
-            </w:r>
-          </w:p>
-        </w:tc>
-        <w:tc>
-          <w:tcPr>
-            <w:tcW w:type="dxa" w:w="7848"/>
-            <w:vAlign w:val="center"/>
-            <w:shd w:fill="FFFFFF"/>
-            <w:tcMar>
-              <w:top w:w="95" w:type="dxa"/>
-              <w:start w:w="115" w:type="dxa"/>
-              <w:bottom w:w="95" w:type="dxa"/>
-              <w:end w:w="115" w:type="dxa"/>
-            </w:tcMar>
-          </w:tcPr>
-          <w:p>
-            <w:pPr>
-              <w:spacing w:after="0" w:line="240" w:lineRule="auto"/>
-            </w:pPr>
-            <w:r/>
-            <w:r>
-              <w:rPr>
-                <w:rFonts w:ascii="Arial" w:hAnsi="Arial"/>
-                <w:b w:val="0"/>
-                <w:color w:val="182B43"/>
-                <w:sz w:val="16"/>
-              </w:rPr>
-              <w:t>Se relaciona con una solicitud aceptada; guarda monto, período, fecha y estado.</w:t>
-            </w:r>
-          </w:p>
-        </w:tc>
-      </w:tr>
-      <w:tr>
-        <w:tc>
-          <w:tcPr>
-            <w:tcW w:type="dxa" w:w="2664"/>
-            <w:vAlign w:val="center"/>
-            <w:shd w:fill="EFF5FA"/>
-            <w:tcMar>
-              <w:top w:w="95" w:type="dxa"/>
-              <w:start w:w="115" w:type="dxa"/>
-              <w:bottom w:w="95" w:type="dxa"/>
-              <w:end w:w="115" w:type="dxa"/>
-            </w:tcMar>
-          </w:tcPr>
-          <w:p>
-            <w:pPr>
-              <w:spacing w:after="0" w:line="240" w:lineRule="auto"/>
-            </w:pPr>
-            <w:r/>
-            <w:r>
-              <w:rPr>
-                <w:rFonts w:ascii="Arial" w:hAnsi="Arial"/>
-                <w:b/>
-                <w:color w:val="182B43"/>
-                <w:sz w:val="16"/>
-              </w:rPr>
-              <w:t>Publication</w:t>
-            </w:r>
-          </w:p>
-        </w:tc>
-        <w:tc>
-          <w:tcPr>
-            <w:tcW w:type="dxa" w:w="7848"/>
-            <w:vAlign w:val="center"/>
-            <w:shd w:fill="EFF5FA"/>
-            <w:tcMar>
-              <w:top w:w="95" w:type="dxa"/>
-              <w:start w:w="115" w:type="dxa"/>
-              <w:bottom w:w="95" w:type="dxa"/>
-              <w:end w:w="115" w:type="dxa"/>
-            </w:tcMar>
-          </w:tcPr>
-          <w:p>
-            <w:pPr>
-              <w:spacing w:after="0" w:line="240" w:lineRule="auto"/>
-            </w:pPr>
-            <w:r/>
-            <w:r>
-              <w:rPr>
-                <w:rFonts w:ascii="Arial" w:hAnsi="Arial"/>
-                <w:b w:val="0"/>
-                <w:color w:val="182B43"/>
-                <w:sz w:val="16"/>
-              </w:rPr>
-              <w:t>Noticia, evento o aviso; título, contenido y fechas.</w:t>
-            </w:r>
-          </w:p>
-        </w:tc>
-      </w:tr>
-      <w:tr>
-        <w:tc>
-          <w:tcPr>
-            <w:tcW w:type="dxa" w:w="2664"/>
-            <w:vAlign w:val="center"/>
-            <w:shd w:fill="FFFFFF"/>
-            <w:tcMar>
-              <w:top w:w="95" w:type="dxa"/>
-              <w:start w:w="115" w:type="dxa"/>
-              <w:bottom w:w="95" w:type="dxa"/>
-              <w:end w:w="115" w:type="dxa"/>
-            </w:tcMar>
-          </w:tcPr>
-          <w:p>
-            <w:pPr>
-              <w:spacing w:after="0" w:line="240" w:lineRule="auto"/>
-            </w:pPr>
-            <w:r/>
-            <w:r>
-              <w:rPr>
-                <w:rFonts w:ascii="Arial" w:hAnsi="Arial"/>
-                <w:b/>
-                <w:color w:val="182B43"/>
-                <w:sz w:val="16"/>
-              </w:rPr>
-              <w:t>Notification</w:t>
-            </w:r>
-          </w:p>
-        </w:tc>
-        <w:tc>
-          <w:tcPr>
-            <w:tcW w:type="dxa" w:w="7848"/>
-            <w:vAlign w:val="center"/>
-            <w:shd w:fill="FFFFFF"/>
-            <w:tcMar>
-              <w:top w:w="95" w:type="dxa"/>
-              <w:start w:w="115" w:type="dxa"/>
-              <w:bottom w:w="95" w:type="dxa"/>
-              <w:end w:w="115" w:type="dxa"/>
-            </w:tcMar>
-          </w:tcPr>
-          <w:p>
-            <w:pPr>
-              <w:spacing w:after="0" w:line="240" w:lineRule="auto"/>
-            </w:pPr>
-            <w:r/>
-            <w:r>
-              <w:rPr>
-                <w:rFonts w:ascii="Arial" w:hAnsi="Arial"/>
-                <w:b w:val="0"/>
-                <w:color w:val="182B43"/>
-                <w:sz w:val="16"/>
-              </w:rPr>
-              <w:t>Mensaje y estado de lectura para un estudiante; puede enlazar una publicación.</w:t>
-            </w:r>
-          </w:p>
-        </w:tc>
-      </w:tr>
-      <w:tr>
-        <w:tc>
-          <w:tcPr>
-            <w:tcW w:type="dxa" w:w="2664"/>
-            <w:vAlign w:val="center"/>
-            <w:shd w:fill="EFF5FA"/>
-            <w:tcMar>
-              <w:top w:w="95" w:type="dxa"/>
-              <w:start w:w="115" w:type="dxa"/>
-              <w:bottom w:w="95" w:type="dxa"/>
-              <w:end w:w="115" w:type="dxa"/>
-            </w:tcMar>
-          </w:tcPr>
-          <w:p>
-            <w:pPr>
-              <w:spacing w:after="0" w:line="240" w:lineRule="auto"/>
-            </w:pPr>
-            <w:r/>
-            <w:r>
-              <w:rPr>
-                <w:rFonts w:ascii="Arial" w:hAnsi="Arial"/>
-                <w:b/>
-                <w:color w:val="182B43"/>
-                <w:sz w:val="16"/>
-              </w:rPr>
-              <w:t>NbuUser / Identity</w:t>
-            </w:r>
-          </w:p>
-        </w:tc>
-        <w:tc>
-          <w:tcPr>
-            <w:tcW w:type="dxa" w:w="7848"/>
-            <w:vAlign w:val="center"/>
-            <w:shd w:fill="EFF5FA"/>
-            <w:tcMar>
-              <w:top w:w="95" w:type="dxa"/>
-              <w:start w:w="115" w:type="dxa"/>
-              <w:bottom w:w="95" w:type="dxa"/>
-              <w:end w:w="115" w:type="dxa"/>
-            </w:tcMar>
-          </w:tcPr>
-          <w:p>
-            <w:pPr>
-              <w:spacing w:after="0" w:line="240" w:lineRule="auto"/>
-            </w:pPr>
-            <w:r/>
-            <w:r>
-              <w:rPr>
-                <w:rFonts w:ascii="Arial" w:hAnsi="Arial"/>
-                <w:b w:val="0"/>
-                <w:color w:val="182B43"/>
-                <w:sz w:val="16"/>
-              </w:rPr>
-              <w:t>Cuenta y rol; StudentId es opcional y único para asociar el portal a un estudiante.</w:t>
+              <w:t>Consulta convocatorias y sus propios datos; presenta solicitudes y ve sus estados, depósitos y avisos.</w:t>
             </w:r>
           </w:p>
         </w:tc>
@@ -1378,52 +2161,104 @@
     </w:tbl>
     <w:p>
       <w:pPr>
-        <w:spacing w:after="0"/>
-      </w:pPr>
-    </w:p>
-    <w:p>
-      <w:pPr>
         <w:pStyle w:val="ListBullet"/>
-        <w:spacing w:after="60"/>
-        <w:ind w:left="317" w:hanging="173"/>
+        <w:widowControl/>
+        <w:spacing w:after="40"/>
+        <w:ind w:left="360" w:hanging="173"/>
       </w:pPr>
       <w:r>
         <w:rPr>
           <w:rFonts w:ascii="Arial" w:hAnsi="Arial"/>
+          <w:b w:val="0"/>
           <w:color w:val="182B43"/>
-          <w:sz w:val="19"/>
+          <w:sz w:val="18"/>
         </w:rPr>
-        <w:t>Un estudiante puede enviar solicitudes para varias becas. Un índice único evita duplicar la misma solicitud para una beca.</w:t>
+        <w:t>Las contraseñas se guardan con el mecanismo de hash de ASP.NET Core Identity.</w:t>
       </w:r>
     </w:p>
     <w:p>
       <w:pPr>
         <w:pStyle w:val="ListBullet"/>
-        <w:spacing w:after="60"/>
-        <w:ind w:left="317" w:hanging="173"/>
+        <w:widowControl/>
+        <w:spacing w:after="40"/>
+        <w:ind w:left="360" w:hanging="173"/>
       </w:pPr>
       <w:r>
         <w:rPr>
           <w:rFonts w:ascii="Arial" w:hAnsi="Arial"/>
+          <w:b w:val="0"/>
           <w:color w:val="182B43"/>
-          <w:sz w:val="19"/>
+          <w:sz w:val="18"/>
         </w:rPr>
-        <w:t>Una solicitud aceptada puede tener varios depósitos. Las claves foráneas protegen los registros relacionados.</w:t>
+        <w:t>El registro web pide nombres, apellidos, cédula, correo, teléfono, universidad, carrera y contraseña; el código de recomendación es opcional.</w:t>
       </w:r>
     </w:p>
     <w:p>
       <w:pPr>
         <w:pStyle w:val="ListBullet"/>
-        <w:spacing w:after="60"/>
-        <w:ind w:left="317" w:hanging="173"/>
+        <w:widowControl/>
+        <w:spacing w:after="40"/>
+        <w:ind w:left="360" w:hanging="173"/>
       </w:pPr>
       <w:r>
         <w:rPr>
           <w:rFonts w:ascii="Arial" w:hAnsi="Arial"/>
+          <w:b w:val="0"/>
           <w:color w:val="182B43"/>
-          <w:sz w:val="19"/>
+          <w:sz w:val="18"/>
         </w:rPr>
-        <w:t>Las publicaciones pueden crear notificaciones para estudiantes activos.</w:t>
+        <w:t>La contraseña del registro acepta solo letras y números y requiere al menos 8 caracteres. El formulario puede mostrarla u ocultarla.</w:t>
+      </w:r>
+    </w:p>
+    <w:p>
+      <w:pPr>
+        <w:pStyle w:val="ListBullet"/>
+        <w:widowControl/>
+        <w:spacing w:after="40"/>
+        <w:ind w:left="360" w:hanging="173"/>
+      </w:pPr>
+      <w:r>
+        <w:rPr>
+          <w:rFonts w:ascii="Arial" w:hAnsi="Arial"/>
+          <w:b w:val="0"/>
+          <w:color w:val="182B43"/>
+          <w:sz w:val="18"/>
+        </w:rPr>
+        <w:t>Un registro nuevo queda pendiente. La persona puede volver a enviar la información si se rechaza, usando el mismo correo y cédula original.</w:t>
+      </w:r>
+    </w:p>
+    <w:p>
+      <w:pPr>
+        <w:pStyle w:val="ListBullet"/>
+        <w:widowControl/>
+        <w:spacing w:after="40"/>
+        <w:ind w:left="360" w:hanging="173"/>
+      </w:pPr>
+      <w:r>
+        <w:rPr>
+          <w:rFonts w:ascii="Arial" w:hAnsi="Arial"/>
+          <w:b w:val="0"/>
+          <w:color w:val="182B43"/>
+          <w:sz w:val="18"/>
+        </w:rPr>
+        <w:t>Los campos únicos impiden duplicar el código estudiantil, la cédula, el correo y la combinación estudiante-beca.</w:t>
+      </w:r>
+    </w:p>
+    <w:p>
+      <w:pPr>
+        <w:pStyle w:val="ListBullet"/>
+        <w:widowControl/>
+        <w:spacing w:after="40"/>
+        <w:ind w:left="360" w:hanging="173"/>
+      </w:pPr>
+      <w:r>
+        <w:rPr>
+          <w:rFonts w:ascii="Arial" w:hAnsi="Arial"/>
+          <w:b w:val="0"/>
+          <w:color w:val="182B43"/>
+          <w:sz w:val="18"/>
+        </w:rPr>
+        <w:t>El respaldo de una solicitud acepta PDF, PNG o JPG y tiene un límite de 5 MB.</w:t>
       </w:r>
     </w:p>
     <w:p>
@@ -1431,19 +2266,84 @@
         <w:pStyle w:val="Heading1"/>
       </w:pPr>
       <w:r>
-        <w:t>4. Acceso y protección de datos</w:t>
+        <w:t>6. Alcance del módulo de pagos</w:t>
       </w:r>
     </w:p>
     <w:tbl>
       <w:tblPr>
+        <w:tblStyle w:val="TableGrid"/>
+        <w:tblW w:type="auto" w:w="0"/>
+        <w:tblLook w:firstColumn="1" w:firstRow="1" w:lastColumn="0" w:lastRow="0" w:noHBand="0" w:noVBand="1" w:val="04A0"/>
+      </w:tblPr>
+      <w:tblGrid>
+        <w:gridCol w:w="9893"/>
+      </w:tblGrid>
+      <w:tr>
+        <w:tc>
+          <w:tcPr>
+            <w:tcW w:type="dxa" w:w="9893"/>
+            <w:vAlign w:val="center"/>
+            <w:shd w:fill="EAF8F8"/>
+            <w:tcMar>
+              <w:top w:w="80" w:type="dxa"/>
+              <w:start w:w="100" w:type="dxa"/>
+              <w:bottom w:w="80" w:type="dxa"/>
+              <w:end w:w="100" w:type="dxa"/>
+            </w:tcMar>
+          </w:tcPr>
+          <w:p>
+            <w:pPr>
+              <w:spacing w:after="0" w:line="245" w:lineRule="auto"/>
+            </w:pPr>
+            <w:r>
+              <w:rPr>
+                <w:b/>
+              </w:rPr>
+            </w:r>
+            <w:r>
+              <w:rPr>
+                <w:rFonts w:ascii="Arial" w:hAnsi="Arial"/>
+                <w:b w:val="0"/>
+                <w:color w:val="092754"/>
+                <w:sz w:val="18"/>
+              </w:rPr>
+              <w:t>No hay movimientos bancarios</w:t>
+            </w:r>
+            <w:r>
+              <w:br/>
+            </w:r>
+            <w:r>
+              <w:rPr>
+                <w:rFonts w:ascii="Arial" w:hAnsi="Arial"/>
+                <w:b w:val="0"/>
+                <w:color w:val="092754"/>
+                <w:sz w:val="18"/>
+              </w:rPr>
+              <w:t>El módulo permite registrar depósitos que se hicieron por fuera de NBU. La tarjeta de transferencias del portal está deshabilitada y no envía ni recibe dinero.</w:t>
+            </w:r>
+          </w:p>
+        </w:tc>
+      </w:tr>
+    </w:tbl>
+    <w:p>
+      <w:pPr>
+        <w:pStyle w:val="Heading1"/>
+      </w:pPr>
+      <w:r>
+        <w:t>7. Tecnologías</w:t>
+      </w:r>
+    </w:p>
+    <w:tbl>
+      <w:tblPr>
+        <w:tblStyle w:val="TableGrid"/>
         <w:tblW w:type="auto" w:w="0"/>
         <w:jc w:val="center"/>
         <w:tblLayout w:type="fixed"/>
         <w:tblLook w:firstColumn="1" w:firstRow="1" w:lastColumn="0" w:lastRow="0" w:noHBand="0" w:noVBand="1" w:val="04A0"/>
       </w:tblPr>
       <w:tblGrid>
-        <w:gridCol w:w="1872"/>
-        <w:gridCol w:w="8640"/>
+        <w:gridCol w:w="3096"/>
+        <w:gridCol w:w="6797"/>
       </w:tblGrid>
       <w:tr>
         <w:trPr>
@@ -1451,270 +2351,19 @@
         </w:trPr>
         <w:tc>
           <w:tcPr>
-            <w:tcW w:type="dxa" w:w="1872"/>
+            <w:tcW w:type="dxa" w:w="3096"/>
+            <w:vAlign w:val="center"/>
             <w:shd w:fill="092754"/>
             <w:tcMar>
-              <w:top w:w="95" w:type="dxa"/>
-              <w:start w:w="115" w:type="dxa"/>
-              <w:bottom w:w="95" w:type="dxa"/>
-              <w:end w:w="115" w:type="dxa"/>
-            </w:tcMar>
-            <w:vAlign w:val="center"/>
-          </w:tcPr>
-          <w:p>
-            <w:pPr>
-              <w:spacing w:after="0"/>
-            </w:pPr>
-            <w:r/>
-            <w:r>
-              <w:rPr>
-                <w:rFonts w:ascii="Arial" w:hAnsi="Arial"/>
-                <w:b/>
-                <w:color w:val="FFFFFF"/>
-                <w:sz w:val="17"/>
-              </w:rPr>
-              <w:t>Perfil</w:t>
-            </w:r>
-          </w:p>
-        </w:tc>
-        <w:tc>
-          <w:tcPr>
-            <w:tcW w:type="dxa" w:w="8640"/>
-            <w:shd w:fill="092754"/>
-            <w:tcMar>
-              <w:top w:w="95" w:type="dxa"/>
-              <w:start w:w="115" w:type="dxa"/>
-              <w:bottom w:w="95" w:type="dxa"/>
-              <w:end w:w="115" w:type="dxa"/>
-            </w:tcMar>
-            <w:vAlign w:val="center"/>
-          </w:tcPr>
-          <w:p>
-            <w:pPr>
-              <w:spacing w:after="0"/>
-            </w:pPr>
-            <w:r/>
-            <w:r>
-              <w:rPr>
-                <w:rFonts w:ascii="Arial" w:hAnsi="Arial"/>
-                <w:b/>
-                <w:color w:val="FFFFFF"/>
-                <w:sz w:val="17"/>
-              </w:rPr>
-              <w:t>Acceso</w:t>
-            </w:r>
-          </w:p>
-        </w:tc>
-      </w:tr>
-      <w:tr>
-        <w:tc>
-          <w:tcPr>
-            <w:tcW w:type="dxa" w:w="1872"/>
-            <w:vAlign w:val="center"/>
-            <w:shd w:fill="EFF5FA"/>
-            <w:tcMar>
-              <w:top w:w="95" w:type="dxa"/>
-              <w:start w:w="115" w:type="dxa"/>
-              <w:bottom w:w="95" w:type="dxa"/>
-              <w:end w:w="115" w:type="dxa"/>
+              <w:top w:w="80" w:type="dxa"/>
+              <w:start w:w="100" w:type="dxa"/>
+              <w:bottom w:w="80" w:type="dxa"/>
+              <w:end w:w="100" w:type="dxa"/>
             </w:tcMar>
           </w:tcPr>
           <w:p>
             <w:pPr>
-              <w:spacing w:after="0" w:line="240" w:lineRule="auto"/>
-            </w:pPr>
-            <w:r/>
-            <w:r>
-              <w:rPr>
-                <w:rFonts w:ascii="Arial" w:hAnsi="Arial"/>
-                <w:b/>
-                <w:color w:val="182B43"/>
-                <w:sz w:val="17"/>
-              </w:rPr>
-              <w:t>Admin</w:t>
-            </w:r>
-          </w:p>
-        </w:tc>
-        <w:tc>
-          <w:tcPr>
-            <w:tcW w:type="dxa" w:w="8640"/>
-            <w:vAlign w:val="center"/>
-            <w:shd w:fill="EFF5FA"/>
-            <w:tcMar>
-              <w:top w:w="95" w:type="dxa"/>
-              <w:start w:w="115" w:type="dxa"/>
-              <w:bottom w:w="95" w:type="dxa"/>
-              <w:end w:w="115" w:type="dxa"/>
-            </w:tcMar>
-          </w:tcPr>
-          <w:p>
-            <w:pPr>
-              <w:spacing w:after="0" w:line="240" w:lineRule="auto"/>
-            </w:pPr>
-            <w:r/>
-            <w:r>
-              <w:rPr>
-                <w:rFonts w:ascii="Arial" w:hAnsi="Arial"/>
-                <w:b w:val="0"/>
-                <w:color w:val="182B43"/>
-                <w:sz w:val="17"/>
-              </w:rPr>
-              <w:t>Controladores CRUD de la web, publicación y revisión de registros, y aplicación Windows Forms.</w:t>
-            </w:r>
-          </w:p>
-        </w:tc>
-      </w:tr>
-      <w:tr>
-        <w:tc>
-          <w:tcPr>
-            <w:tcW w:type="dxa" w:w="1872"/>
-            <w:vAlign w:val="center"/>
-            <w:shd w:fill="FFFFFF"/>
-            <w:tcMar>
-              <w:top w:w="95" w:type="dxa"/>
-              <w:start w:w="115" w:type="dxa"/>
-              <w:bottom w:w="95" w:type="dxa"/>
-              <w:end w:w="115" w:type="dxa"/>
-            </w:tcMar>
-          </w:tcPr>
-          <w:p>
-            <w:pPr>
-              <w:spacing w:after="0" w:line="240" w:lineRule="auto"/>
-            </w:pPr>
-            <w:r/>
-            <w:r>
-              <w:rPr>
-                <w:rFonts w:ascii="Arial" w:hAnsi="Arial"/>
-                <w:b/>
-                <w:color w:val="182B43"/>
-                <w:sz w:val="17"/>
-              </w:rPr>
-              <w:t>Student</w:t>
-            </w:r>
-          </w:p>
-        </w:tc>
-        <w:tc>
-          <w:tcPr>
-            <w:tcW w:type="dxa" w:w="8640"/>
-            <w:vAlign w:val="center"/>
-            <w:shd w:fill="FFFFFF"/>
-            <w:tcMar>
-              <w:top w:w="95" w:type="dxa"/>
-              <w:start w:w="115" w:type="dxa"/>
-              <w:bottom w:w="95" w:type="dxa"/>
-              <w:end w:w="115" w:type="dxa"/>
-            </w:tcMar>
-          </w:tcPr>
-          <w:p>
-            <w:pPr>
-              <w:spacing w:after="0" w:line="240" w:lineRule="auto"/>
-            </w:pPr>
-            <w:r/>
-            <w:r>
-              <w:rPr>
-                <w:rFonts w:ascii="Arial" w:hAnsi="Arial"/>
-                <w:b w:val="0"/>
-                <w:color w:val="182B43"/>
-                <w:sz w:val="17"/>
-              </w:rPr>
-              <w:t>Convocatorias y sus propias solicitudes, pagos y notificaciones; noticias y eventos publicados.</w:t>
-            </w:r>
-          </w:p>
-        </w:tc>
-      </w:tr>
-    </w:tbl>
-    <w:p>
-      <w:pPr>
-        <w:spacing w:after="0"/>
-      </w:pPr>
-    </w:p>
-    <w:p>
-      <w:pPr>
-        <w:widowControl/>
-      </w:pPr>
-      <w:r>
-        <w:rPr>
-          <w:rFonts w:ascii="Arial" w:hAnsi="Arial"/>
-          <w:color w:val="182B43"/>
-        </w:rPr>
-        <w:t>ASP.NET Core Identity guarda las contraseñas con hash, controla los intentos fallidos y emite una cookie HttpOnly. Las acciones de escritura usan protección antifalsificación. El portal obtiene el StudentId desde la cuenta autenticada y filtra cada consulta con ese identificador; no acepta un StudentId enviado por el navegador.</w:t>
-      </w:r>
-    </w:p>
-    <w:p>
-      <w:pPr>
-        <w:widowControl/>
-      </w:pPr>
-      <w:r>
-        <w:rPr>
-          <w:rFonts w:ascii="Arial" w:hAnsi="Arial"/>
-          <w:color w:val="182B43"/>
-        </w:rPr>
-        <w:t>La aplicación de escritorio valida el hash de contraseña y el rol Admin en las tablas Identity antes de abrir el panel. Una cuenta Student no puede abrir el programa administrativo.</w:t>
-      </w:r>
-    </w:p>
-    <w:p>
-      <w:pPr>
-        <w:pStyle w:val="Heading1"/>
-      </w:pPr>
-      <w:r>
-        <w:t>5. Alcance de depósitos y transferencias</w:t>
-      </w:r>
-    </w:p>
-    <w:p>
-      <w:pPr>
-        <w:widowControl/>
-      </w:pPr>
-      <w:r>
-        <w:rPr>
-          <w:rFonts w:ascii="Arial" w:hAnsi="Arial"/>
-          <w:color w:val="182B43"/>
-        </w:rPr>
-        <w:t>El módulo de pagos guarda depósitos que el personal registra después de haber sido realizados fuera del sistema. La opción de transferencias bancarias del portal es una tarjeta visual deshabilitada. No existe integración bancaria ni operación para enviar, recibir o mover fondos.</w:t>
-      </w:r>
-    </w:p>
-    <w:p>
-      <w:r>
-        <w:br w:type="page"/>
-      </w:r>
-    </w:p>
-    <w:p>
-      <w:pPr>
-        <w:pStyle w:val="Heading1"/>
-      </w:pPr>
-      <w:r>
-        <w:t>6. Tecnologías</w:t>
-      </w:r>
-    </w:p>
-    <w:tbl>
-      <w:tblPr>
-        <w:tblW w:type="auto" w:w="0"/>
-        <w:jc w:val="center"/>
-        <w:tblLayout w:type="fixed"/>
-        <w:tblLook w:firstColumn="1" w:firstRow="1" w:lastColumn="0" w:lastRow="0" w:noHBand="0" w:noVBand="1" w:val="04A0"/>
-      </w:tblPr>
-      <w:tblGrid>
-        <w:gridCol w:w="3168"/>
-        <w:gridCol w:w="7344"/>
-      </w:tblGrid>
-      <w:tr>
-        <w:trPr>
-          <w:tblHeader w:val="true"/>
-        </w:trPr>
-        <w:tc>
-          <w:tcPr>
-            <w:tcW w:type="dxa" w:w="3168"/>
-            <w:shd w:fill="092754"/>
-            <w:tcMar>
-              <w:top w:w="95" w:type="dxa"/>
-              <w:start w:w="115" w:type="dxa"/>
-              <w:bottom w:w="95" w:type="dxa"/>
-              <w:end w:w="115" w:type="dxa"/>
-            </w:tcMar>
-            <w:vAlign w:val="center"/>
-          </w:tcPr>
-          <w:p>
-            <w:pPr>
-              <w:spacing w:after="0"/>
+              <w:spacing w:after="0" w:line="245" w:lineRule="auto"/>
             </w:pPr>
             <w:r/>
             <w:r>
@@ -1730,19 +2379,19 @@
         </w:tc>
         <w:tc>
           <w:tcPr>
-            <w:tcW w:type="dxa" w:w="7344"/>
+            <w:tcW w:type="dxa" w:w="6797"/>
+            <w:vAlign w:val="center"/>
             <w:shd w:fill="092754"/>
             <w:tcMar>
-              <w:top w:w="95" w:type="dxa"/>
-              <w:start w:w="115" w:type="dxa"/>
-              <w:bottom w:w="95" w:type="dxa"/>
-              <w:end w:w="115" w:type="dxa"/>
+              <w:top w:w="80" w:type="dxa"/>
+              <w:start w:w="100" w:type="dxa"/>
+              <w:bottom w:w="80" w:type="dxa"/>
+              <w:end w:w="100" w:type="dxa"/>
             </w:tcMar>
-            <w:vAlign w:val="center"/>
           </w:tcPr>
           <w:p>
             <w:pPr>
-              <w:spacing w:after="0"/>
+              <w:spacing w:after="0" w:line="245" w:lineRule="auto"/>
             </w:pPr>
             <w:r/>
             <w:r>
@@ -1752,7 +2401,7 @@
                 <w:color w:val="FFFFFF"/>
                 <w:sz w:val="16"/>
               </w:rPr>
-              <w:t>Versión / uso</w:t>
+              <w:t>Versión/uso</w:t>
             </w:r>
           </w:p>
         </w:tc>
@@ -1760,19 +2409,19 @@
       <w:tr>
         <w:tc>
           <w:tcPr>
-            <w:tcW w:type="dxa" w:w="3168"/>
+            <w:tcW w:type="dxa" w:w="3096"/>
             <w:vAlign w:val="center"/>
             <w:shd w:fill="EFF5FA"/>
             <w:tcMar>
-              <w:top w:w="95" w:type="dxa"/>
-              <w:start w:w="115" w:type="dxa"/>
-              <w:bottom w:w="95" w:type="dxa"/>
-              <w:end w:w="115" w:type="dxa"/>
+              <w:top w:w="80" w:type="dxa"/>
+              <w:start w:w="100" w:type="dxa"/>
+              <w:bottom w:w="80" w:type="dxa"/>
+              <w:end w:w="100" w:type="dxa"/>
             </w:tcMar>
           </w:tcPr>
           <w:p>
             <w:pPr>
-              <w:spacing w:after="0" w:line="240" w:lineRule="auto"/>
+              <w:spacing w:after="0" w:line="245" w:lineRule="auto"/>
             </w:pPr>
             <w:r/>
             <w:r>
@@ -1782,25 +2431,25 @@
                 <w:color w:val="182B43"/>
                 <w:sz w:val="16"/>
               </w:rPr>
-              <w:t>C#</w:t>
+              <w:t>C# / .NET</w:t>
             </w:r>
           </w:p>
         </w:tc>
         <w:tc>
           <w:tcPr>
-            <w:tcW w:type="dxa" w:w="7344"/>
+            <w:tcW w:type="dxa" w:w="6797"/>
             <w:vAlign w:val="center"/>
             <w:shd w:fill="EFF5FA"/>
             <w:tcMar>
-              <w:top w:w="95" w:type="dxa"/>
-              <w:start w:w="115" w:type="dxa"/>
-              <w:bottom w:w="95" w:type="dxa"/>
-              <w:end w:w="115" w:type="dxa"/>
+              <w:top w:w="80" w:type="dxa"/>
+              <w:start w:w="100" w:type="dxa"/>
+              <w:bottom w:w="80" w:type="dxa"/>
+              <w:end w:w="100" w:type="dxa"/>
             </w:tcMar>
           </w:tcPr>
           <w:p>
             <w:pPr>
-              <w:spacing w:after="0" w:line="240" w:lineRule="auto"/>
+              <w:spacing w:after="0" w:line="245" w:lineRule="auto"/>
             </w:pPr>
             <w:r/>
             <w:r>
@@ -1810,7 +2459,7 @@
                 <w:color w:val="182B43"/>
                 <w:sz w:val="16"/>
               </w:rPr>
-              <w:t>12</w:t>
+              <w:t>C# 12 y .NET 8</w:t>
             </w:r>
           </w:p>
         </w:tc>
@@ -1818,19 +2467,19 @@
       <w:tr>
         <w:tc>
           <w:tcPr>
-            <w:tcW w:type="dxa" w:w="3168"/>
+            <w:tcW w:type="dxa" w:w="3096"/>
             <w:vAlign w:val="center"/>
             <w:shd w:fill="FFFFFF"/>
             <w:tcMar>
-              <w:top w:w="95" w:type="dxa"/>
-              <w:start w:w="115" w:type="dxa"/>
-              <w:bottom w:w="95" w:type="dxa"/>
-              <w:end w:w="115" w:type="dxa"/>
+              <w:top w:w="80" w:type="dxa"/>
+              <w:start w:w="100" w:type="dxa"/>
+              <w:bottom w:w="80" w:type="dxa"/>
+              <w:end w:w="100" w:type="dxa"/>
             </w:tcMar>
           </w:tcPr>
           <w:p>
             <w:pPr>
-              <w:spacing w:after="0" w:line="240" w:lineRule="auto"/>
+              <w:spacing w:after="0" w:line="245" w:lineRule="auto"/>
             </w:pPr>
             <w:r/>
             <w:r>
@@ -1840,25 +2489,25 @@
                 <w:color w:val="182B43"/>
                 <w:sz w:val="16"/>
               </w:rPr>
-              <w:t>.NET</w:t>
+              <w:t>Aplicación web</w:t>
             </w:r>
           </w:p>
         </w:tc>
         <w:tc>
           <w:tcPr>
-            <w:tcW w:type="dxa" w:w="7344"/>
+            <w:tcW w:type="dxa" w:w="6797"/>
             <w:vAlign w:val="center"/>
             <w:shd w:fill="FFFFFF"/>
             <w:tcMar>
-              <w:top w:w="95" w:type="dxa"/>
-              <w:start w:w="115" w:type="dxa"/>
-              <w:bottom w:w="95" w:type="dxa"/>
-              <w:end w:w="115" w:type="dxa"/>
+              <w:top w:w="80" w:type="dxa"/>
+              <w:start w:w="100" w:type="dxa"/>
+              <w:bottom w:w="80" w:type="dxa"/>
+              <w:end w:w="100" w:type="dxa"/>
             </w:tcMar>
           </w:tcPr>
           <w:p>
             <w:pPr>
-              <w:spacing w:after="0" w:line="240" w:lineRule="auto"/>
+              <w:spacing w:after="0" w:line="245" w:lineRule="auto"/>
             </w:pPr>
             <w:r/>
             <w:r>
@@ -1868,7 +2517,7 @@
                 <w:color w:val="182B43"/>
                 <w:sz w:val="16"/>
               </w:rPr>
-              <w:t>8</w:t>
+              <w:t>ASP.NET Core MVC y Razor</w:t>
             </w:r>
           </w:p>
         </w:tc>
@@ -1876,19 +2525,19 @@
       <w:tr>
         <w:tc>
           <w:tcPr>
-            <w:tcW w:type="dxa" w:w="3168"/>
+            <w:tcW w:type="dxa" w:w="3096"/>
             <w:vAlign w:val="center"/>
             <w:shd w:fill="EFF5FA"/>
             <w:tcMar>
-              <w:top w:w="95" w:type="dxa"/>
-              <w:start w:w="115" w:type="dxa"/>
-              <w:bottom w:w="95" w:type="dxa"/>
-              <w:end w:w="115" w:type="dxa"/>
+              <w:top w:w="80" w:type="dxa"/>
+              <w:start w:w="100" w:type="dxa"/>
+              <w:bottom w:w="80" w:type="dxa"/>
+              <w:end w:w="100" w:type="dxa"/>
             </w:tcMar>
           </w:tcPr>
           <w:p>
             <w:pPr>
-              <w:spacing w:after="0" w:line="240" w:lineRule="auto"/>
+              <w:spacing w:after="0" w:line="245" w:lineRule="auto"/>
             </w:pPr>
             <w:r/>
             <w:r>
@@ -1898,25 +2547,25 @@
                 <w:color w:val="182B43"/>
                 <w:sz w:val="16"/>
               </w:rPr>
-              <w:t>ASP.NET Core MVC</w:t>
+              <w:t>Aplicación de escritorio</w:t>
             </w:r>
           </w:p>
         </w:tc>
         <w:tc>
           <w:tcPr>
-            <w:tcW w:type="dxa" w:w="7344"/>
+            <w:tcW w:type="dxa" w:w="6797"/>
             <w:vAlign w:val="center"/>
             <w:shd w:fill="EFF5FA"/>
             <w:tcMar>
-              <w:top w:w="95" w:type="dxa"/>
-              <w:start w:w="115" w:type="dxa"/>
-              <w:bottom w:w="95" w:type="dxa"/>
-              <w:end w:w="115" w:type="dxa"/>
+              <w:top w:w="80" w:type="dxa"/>
+              <w:start w:w="100" w:type="dxa"/>
+              <w:bottom w:w="80" w:type="dxa"/>
+              <w:end w:w="100" w:type="dxa"/>
             </w:tcMar>
           </w:tcPr>
           <w:p>
             <w:pPr>
-              <w:spacing w:after="0" w:line="240" w:lineRule="auto"/>
+              <w:spacing w:after="0" w:line="245" w:lineRule="auto"/>
             </w:pPr>
             <w:r/>
             <w:r>
@@ -1926,7 +2575,7 @@
                 <w:color w:val="182B43"/>
                 <w:sz w:val="16"/>
               </w:rPr>
-              <w:t>Aplicación web</w:t>
+              <w:t>Windows Forms</w:t>
             </w:r>
           </w:p>
         </w:tc>
@@ -1934,19 +2583,19 @@
       <w:tr>
         <w:tc>
           <w:tcPr>
-            <w:tcW w:type="dxa" w:w="3168"/>
+            <w:tcW w:type="dxa" w:w="3096"/>
             <w:vAlign w:val="center"/>
             <w:shd w:fill="FFFFFF"/>
             <w:tcMar>
-              <w:top w:w="95" w:type="dxa"/>
-              <w:start w:w="115" w:type="dxa"/>
-              <w:bottom w:w="95" w:type="dxa"/>
-              <w:end w:w="115" w:type="dxa"/>
+              <w:top w:w="80" w:type="dxa"/>
+              <w:start w:w="100" w:type="dxa"/>
+              <w:bottom w:w="80" w:type="dxa"/>
+              <w:end w:w="100" w:type="dxa"/>
             </w:tcMar>
           </w:tcPr>
           <w:p>
             <w:pPr>
-              <w:spacing w:after="0" w:line="240" w:lineRule="auto"/>
+              <w:spacing w:after="0" w:line="245" w:lineRule="auto"/>
             </w:pPr>
             <w:r/>
             <w:r>
@@ -1956,25 +2605,25 @@
                 <w:color w:val="182B43"/>
                 <w:sz w:val="16"/>
               </w:rPr>
-              <w:t>Windows Forms</w:t>
+              <w:t>ORM</w:t>
             </w:r>
           </w:p>
         </w:tc>
         <w:tc>
           <w:tcPr>
-            <w:tcW w:type="dxa" w:w="7344"/>
+            <w:tcW w:type="dxa" w:w="6797"/>
             <w:vAlign w:val="center"/>
             <w:shd w:fill="FFFFFF"/>
             <w:tcMar>
-              <w:top w:w="95" w:type="dxa"/>
-              <w:start w:w="115" w:type="dxa"/>
-              <w:bottom w:w="95" w:type="dxa"/>
-              <w:end w:w="115" w:type="dxa"/>
+              <w:top w:w="80" w:type="dxa"/>
+              <w:start w:w="100" w:type="dxa"/>
+              <w:bottom w:w="80" w:type="dxa"/>
+              <w:end w:w="100" w:type="dxa"/>
             </w:tcMar>
           </w:tcPr>
           <w:p>
             <w:pPr>
-              <w:spacing w:after="0" w:line="240" w:lineRule="auto"/>
+              <w:spacing w:after="0" w:line="245" w:lineRule="auto"/>
             </w:pPr>
             <w:r/>
             <w:r>
@@ -1984,7 +2633,7 @@
                 <w:color w:val="182B43"/>
                 <w:sz w:val="16"/>
               </w:rPr>
-              <w:t>Aplicación de escritorio</w:t>
+              <w:t>Entity Framework Core 8</w:t>
             </w:r>
           </w:p>
         </w:tc>
@@ -1992,19 +2641,19 @@
       <w:tr>
         <w:tc>
           <w:tcPr>
-            <w:tcW w:type="dxa" w:w="3168"/>
+            <w:tcW w:type="dxa" w:w="3096"/>
             <w:vAlign w:val="center"/>
             <w:shd w:fill="EFF5FA"/>
             <w:tcMar>
-              <w:top w:w="95" w:type="dxa"/>
-              <w:start w:w="115" w:type="dxa"/>
-              <w:bottom w:w="95" w:type="dxa"/>
-              <w:end w:w="115" w:type="dxa"/>
+              <w:top w:w="80" w:type="dxa"/>
+              <w:start w:w="100" w:type="dxa"/>
+              <w:bottom w:w="80" w:type="dxa"/>
+              <w:end w:w="100" w:type="dxa"/>
             </w:tcMar>
           </w:tcPr>
           <w:p>
             <w:pPr>
-              <w:spacing w:after="0" w:line="240" w:lineRule="auto"/>
+              <w:spacing w:after="0" w:line="245" w:lineRule="auto"/>
             </w:pPr>
             <w:r/>
             <w:r>
@@ -2014,25 +2663,25 @@
                 <w:color w:val="182B43"/>
                 <w:sz w:val="16"/>
               </w:rPr>
-              <w:t>Entity Framework Core</w:t>
+              <w:t>Base de datos</w:t>
             </w:r>
           </w:p>
         </w:tc>
         <w:tc>
           <w:tcPr>
-            <w:tcW w:type="dxa" w:w="7344"/>
+            <w:tcW w:type="dxa" w:w="6797"/>
             <w:vAlign w:val="center"/>
             <w:shd w:fill="EFF5FA"/>
             <w:tcMar>
-              <w:top w:w="95" w:type="dxa"/>
-              <w:start w:w="115" w:type="dxa"/>
-              <w:bottom w:w="95" w:type="dxa"/>
-              <w:end w:w="115" w:type="dxa"/>
+              <w:top w:w="80" w:type="dxa"/>
+              <w:start w:w="100" w:type="dxa"/>
+              <w:bottom w:w="80" w:type="dxa"/>
+              <w:end w:w="100" w:type="dxa"/>
             </w:tcMar>
           </w:tcPr>
           <w:p>
             <w:pPr>
-              <w:spacing w:after="0" w:line="240" w:lineRule="auto"/>
+              <w:spacing w:after="0" w:line="245" w:lineRule="auto"/>
             </w:pPr>
             <w:r/>
             <w:r>
@@ -2042,7 +2691,7 @@
                 <w:color w:val="182B43"/>
                 <w:sz w:val="16"/>
               </w:rPr>
-              <w:t>8 · ORM y migraciones</w:t>
+              <w:t>SQL Server 2022 Express</w:t>
             </w:r>
           </w:p>
         </w:tc>
@@ -2050,19 +2699,19 @@
       <w:tr>
         <w:tc>
           <w:tcPr>
-            <w:tcW w:type="dxa" w:w="3168"/>
+            <w:tcW w:type="dxa" w:w="3096"/>
             <w:vAlign w:val="center"/>
             <w:shd w:fill="FFFFFF"/>
             <w:tcMar>
-              <w:top w:w="95" w:type="dxa"/>
-              <w:start w:w="115" w:type="dxa"/>
-              <w:bottom w:w="95" w:type="dxa"/>
-              <w:end w:w="115" w:type="dxa"/>
+              <w:top w:w="80" w:type="dxa"/>
+              <w:start w:w="100" w:type="dxa"/>
+              <w:bottom w:w="80" w:type="dxa"/>
+              <w:end w:w="100" w:type="dxa"/>
             </w:tcMar>
           </w:tcPr>
           <w:p>
             <w:pPr>
-              <w:spacing w:after="0" w:line="240" w:lineRule="auto"/>
+              <w:spacing w:after="0" w:line="245" w:lineRule="auto"/>
             </w:pPr>
             <w:r/>
             <w:r>
@@ -2072,25 +2721,25 @@
                 <w:color w:val="182B43"/>
                 <w:sz w:val="16"/>
               </w:rPr>
-              <w:t>SQL Server</w:t>
+              <w:t>Interfaz web</w:t>
             </w:r>
           </w:p>
         </w:tc>
         <w:tc>
           <w:tcPr>
-            <w:tcW w:type="dxa" w:w="7344"/>
+            <w:tcW w:type="dxa" w:w="6797"/>
             <w:vAlign w:val="center"/>
             <w:shd w:fill="FFFFFF"/>
             <w:tcMar>
-              <w:top w:w="95" w:type="dxa"/>
-              <w:start w:w="115" w:type="dxa"/>
-              <w:bottom w:w="95" w:type="dxa"/>
-              <w:end w:w="115" w:type="dxa"/>
+              <w:top w:w="80" w:type="dxa"/>
+              <w:start w:w="100" w:type="dxa"/>
+              <w:bottom w:w="80" w:type="dxa"/>
+              <w:end w:w="100" w:type="dxa"/>
             </w:tcMar>
           </w:tcPr>
           <w:p>
             <w:pPr>
-              <w:spacing w:after="0" w:line="240" w:lineRule="auto"/>
+              <w:spacing w:after="0" w:line="245" w:lineRule="auto"/>
             </w:pPr>
             <w:r/>
             <w:r>
@@ -2100,7 +2749,7 @@
                 <w:color w:val="182B43"/>
                 <w:sz w:val="16"/>
               </w:rPr>
-              <w:t>Base compartida; configuración inicial SQLEXPRESS22</w:t>
+              <w:t>Bootstrap y CSS adaptable a pantallas pequeñas</w:t>
             </w:r>
           </w:p>
         </w:tc>
@@ -2108,19 +2757,19 @@
       <w:tr>
         <w:tc>
           <w:tcPr>
-            <w:tcW w:type="dxa" w:w="3168"/>
+            <w:tcW w:type="dxa" w:w="3096"/>
             <w:vAlign w:val="center"/>
             <w:shd w:fill="EFF5FA"/>
             <w:tcMar>
-              <w:top w:w="95" w:type="dxa"/>
-              <w:start w:w="115" w:type="dxa"/>
-              <w:bottom w:w="95" w:type="dxa"/>
-              <w:end w:w="115" w:type="dxa"/>
+              <w:top w:w="80" w:type="dxa"/>
+              <w:start w:w="100" w:type="dxa"/>
+              <w:bottom w:w="80" w:type="dxa"/>
+              <w:end w:w="100" w:type="dxa"/>
             </w:tcMar>
           </w:tcPr>
           <w:p>
             <w:pPr>
-              <w:spacing w:after="0" w:line="240" w:lineRule="auto"/>
+              <w:spacing w:after="0" w:line="245" w:lineRule="auto"/>
             </w:pPr>
             <w:r/>
             <w:r>
@@ -2130,25 +2779,25 @@
                 <w:color w:val="182B43"/>
                 <w:sz w:val="16"/>
               </w:rPr>
-              <w:t>Bootstrap</w:t>
+              <w:t>IDE y control de versiones</w:t>
             </w:r>
           </w:p>
         </w:tc>
         <w:tc>
           <w:tcPr>
-            <w:tcW w:type="dxa" w:w="7344"/>
+            <w:tcW w:type="dxa" w:w="6797"/>
             <w:vAlign w:val="center"/>
             <w:shd w:fill="EFF5FA"/>
             <w:tcMar>
-              <w:top w:w="95" w:type="dxa"/>
-              <w:start w:w="115" w:type="dxa"/>
-              <w:bottom w:w="95" w:type="dxa"/>
-              <w:end w:w="115" w:type="dxa"/>
+              <w:top w:w="80" w:type="dxa"/>
+              <w:start w:w="100" w:type="dxa"/>
+              <w:bottom w:w="80" w:type="dxa"/>
+              <w:end w:w="100" w:type="dxa"/>
             </w:tcMar>
           </w:tcPr>
           <w:p>
             <w:pPr>
-              <w:spacing w:after="0" w:line="240" w:lineRule="auto"/>
+              <w:spacing w:after="0" w:line="245" w:lineRule="auto"/>
             </w:pPr>
             <w:r/>
             <w:r>
@@ -2158,401 +2807,117 @@
                 <w:color w:val="182B43"/>
                 <w:sz w:val="16"/>
               </w:rPr>
-              <w:t>Navegación y componentes web adaptables</w:t>
+              <w:t>Visual Studio 2022, Git y GitHub</w:t>
             </w:r>
           </w:p>
         </w:tc>
       </w:tr>
     </w:tbl>
     <w:p>
-      <w:pPr>
-        <w:spacing w:after="0"/>
-      </w:pPr>
+      <w:r>
+        <w:br w:type="page"/>
+      </w:r>
     </w:p>
     <w:p>
       <w:pPr>
         <w:pStyle w:val="Heading1"/>
       </w:pPr>
       <w:r>
-        <w:t>7. Instalación y ejecución local</w:t>
+        <w:t>8. Preparar el entorno</w:t>
       </w:r>
     </w:p>
     <w:p>
       <w:pPr>
         <w:pStyle w:val="ListBullet"/>
-        <w:spacing w:after="60"/>
-        <w:ind w:left="317" w:hanging="173"/>
+        <w:widowControl/>
+        <w:spacing w:after="40"/>
+        <w:ind w:left="360" w:hanging="173"/>
       </w:pPr>
       <w:r>
         <w:rPr>
           <w:rFonts w:ascii="Arial" w:hAnsi="Arial"/>
+          <w:b w:val="0"/>
           <w:color w:val="182B43"/>
-          <w:sz w:val="19"/>
+          <w:sz w:val="18"/>
         </w:rPr>
-        <w:t>Instalar .NET 8 SDK y SQL Server Express. La instancia usada en el equipo de desarrollo es SQLEXPRESS22.</w:t>
+        <w:t>Instala el SDK de .NET 8, SQL Server Express y SQL Server Management Studio.</w:t>
       </w:r>
     </w:p>
     <w:p>
       <w:pPr>
         <w:pStyle w:val="ListBullet"/>
-        <w:spacing w:after="60"/>
-        <w:ind w:left="317" w:hanging="173"/>
+        <w:widowControl/>
+        <w:spacing w:after="40"/>
+        <w:ind w:left="360" w:hanging="173"/>
       </w:pPr>
       <w:r>
         <w:rPr>
           <w:rFonts w:ascii="Arial" w:hAnsi="Arial"/>
+          <w:b w:val="0"/>
           <w:color w:val="182B43"/>
-          <w:sz w:val="19"/>
+          <w:sz w:val="18"/>
         </w:rPr>
-        <w:t>Verificar la cadena de conexión en NBU.Web/appsettings.json y NBU.Desktop/appsettings.json.</w:t>
+        <w:t>Inicia el servicio de la instancia .\SQLEXPRESS22 antes de abrir las aplicaciones.</w:t>
       </w:r>
     </w:p>
     <w:p>
       <w:pPr>
         <w:pStyle w:val="ListBullet"/>
-        <w:spacing w:after="60"/>
-        <w:ind w:left="317" w:hanging="173"/>
+        <w:widowControl/>
+        <w:spacing w:after="40"/>
+        <w:ind w:left="360" w:hanging="173"/>
       </w:pPr>
       <w:r>
         <w:rPr>
           <w:rFonts w:ascii="Arial" w:hAnsi="Arial"/>
+          <w:b w:val="0"/>
           <w:color w:val="182B43"/>
-          <w:sz w:val="19"/>
+          <w:sz w:val="18"/>
         </w:rPr>
-        <w:t>Desde la raíz, ejecutar dotnet run --project NBU.Web en modo Development. El portal aplica migraciones y agrega datos de muestra.</w:t>
+        <w:t>Revisa que NBU.Web/appsettings.json y NBU.Desktop/appsettings.json apunten a Server=.\SQLEXPRESS22;Database=NBU.</w:t>
       </w:r>
     </w:p>
     <w:p>
       <w:pPr>
         <w:pStyle w:val="ListBullet"/>
-        <w:spacing w:after="60"/>
-        <w:ind w:left="317" w:hanging="173"/>
+        <w:widowControl/>
+        <w:spacing w:after="40"/>
+        <w:ind w:left="360" w:hanging="173"/>
       </w:pPr>
       <w:r>
         <w:rPr>
           <w:rFonts w:ascii="Arial" w:hAnsi="Arial"/>
+          <w:b w:val="0"/>
           <w:color w:val="182B43"/>
-          <w:sz w:val="19"/>
+          <w:sz w:val="18"/>
         </w:rPr>
-        <w:t>Abrir la dirección local indicada por la terminal e iniciar sesión con una de las cuentas de demostración.</w:t>
+        <w:t>Si la base aún no existe, crea/aplica el esquema con database/NBU.sql o inicia la web en Development para ejecutar las migraciones y el seeder de demostración.</w:t>
       </w:r>
     </w:p>
     <w:p>
       <w:pPr>
         <w:pStyle w:val="ListBullet"/>
-        <w:spacing w:after="60"/>
-        <w:ind w:left="317" w:hanging="173"/>
+        <w:widowControl/>
+        <w:spacing w:after="40"/>
+        <w:ind w:left="360" w:hanging="173"/>
       </w:pPr>
       <w:r>
         <w:rPr>
           <w:rFonts w:ascii="Arial" w:hAnsi="Arial"/>
+          <w:b w:val="0"/>
           <w:color w:val="182B43"/>
-          <w:sz w:val="19"/>
+          <w:sz w:val="18"/>
         </w:rPr>
-        <w:t>Ejecutar dotnet run --project NBU.Desktop para abrir el acceso administrativo de Windows Forms.</w:t>
+        <w:t>No borres entregables/escritorio/appsettings.json ni entregables/escritorio/nbu-mark.png: acompañan al ejecutable publicado.</w:t>
       </w:r>
     </w:p>
     <w:p>
       <w:pPr>
-        <w:pStyle w:val="ListBullet"/>
-        <w:spacing w:after="60"/>
-        <w:ind w:left="317" w:hanging="173"/>
+        <w:pStyle w:val="Heading1"/>
       </w:pPr>
       <w:r>
-        <w:rPr>
-          <w:rFonts w:ascii="Arial" w:hAnsi="Arial"/>
-          <w:color w:val="182B43"/>
-          <w:sz w:val="19"/>
-        </w:rPr>
-        <w:t>Para instalar manualmente el esquema en SSMS, seleccionar la base NBU y ejecutar database/NBU.sql.</w:t>
+        <w:t>9. Abrir las aplicaciones</w:t>
       </w:r>
-    </w:p>
-    <w:p>
-      <w:pPr>
-        <w:pStyle w:val="Heading2"/>
-      </w:pPr>
-      <w:r>
-        <w:t>Cuentas de demostración</w:t>
-      </w:r>
-    </w:p>
-    <w:tbl>
-      <w:tblPr>
-        <w:tblW w:type="auto" w:w="0"/>
-        <w:jc w:val="center"/>
-        <w:tblLayout w:type="fixed"/>
-        <w:tblLook w:firstColumn="1" w:firstRow="1" w:lastColumn="0" w:lastRow="0" w:noHBand="0" w:noVBand="1" w:val="04A0"/>
-      </w:tblPr>
-      <w:tblGrid>
-        <w:gridCol w:w="2160"/>
-        <w:gridCol w:w="3888"/>
-        <w:gridCol w:w="4464"/>
-      </w:tblGrid>
-      <w:tr>
-        <w:trPr>
-          <w:tblHeader w:val="true"/>
-        </w:trPr>
-        <w:tc>
-          <w:tcPr>
-            <w:tcW w:type="dxa" w:w="2160"/>
-            <w:shd w:fill="092754"/>
-            <w:tcMar>
-              <w:top w:w="95" w:type="dxa"/>
-              <w:start w:w="115" w:type="dxa"/>
-              <w:bottom w:w="95" w:type="dxa"/>
-              <w:end w:w="115" w:type="dxa"/>
-            </w:tcMar>
-            <w:vAlign w:val="center"/>
-          </w:tcPr>
-          <w:p>
-            <w:pPr>
-              <w:spacing w:after="0"/>
-            </w:pPr>
-            <w:r/>
-            <w:r>
-              <w:rPr>
-                <w:rFonts w:ascii="Arial" w:hAnsi="Arial"/>
-                <w:b/>
-                <w:color w:val="FFFFFF"/>
-                <w:sz w:val="16"/>
-              </w:rPr>
-              <w:t>Perfil</w:t>
-            </w:r>
-          </w:p>
-        </w:tc>
-        <w:tc>
-          <w:tcPr>
-            <w:tcW w:type="dxa" w:w="3888"/>
-            <w:shd w:fill="092754"/>
-            <w:tcMar>
-              <w:top w:w="95" w:type="dxa"/>
-              <w:start w:w="115" w:type="dxa"/>
-              <w:bottom w:w="95" w:type="dxa"/>
-              <w:end w:w="115" w:type="dxa"/>
-            </w:tcMar>
-            <w:vAlign w:val="center"/>
-          </w:tcPr>
-          <w:p>
-            <w:pPr>
-              <w:spacing w:after="0"/>
-            </w:pPr>
-            <w:r/>
-            <w:r>
-              <w:rPr>
-                <w:rFonts w:ascii="Arial" w:hAnsi="Arial"/>
-                <w:b/>
-                <w:color w:val="FFFFFF"/>
-                <w:sz w:val="16"/>
-              </w:rPr>
-              <w:t>Correo</w:t>
-            </w:r>
-          </w:p>
-        </w:tc>
-        <w:tc>
-          <w:tcPr>
-            <w:tcW w:type="dxa" w:w="4464"/>
-            <w:shd w:fill="092754"/>
-            <w:tcMar>
-              <w:top w:w="95" w:type="dxa"/>
-              <w:start w:w="115" w:type="dxa"/>
-              <w:bottom w:w="95" w:type="dxa"/>
-              <w:end w:w="115" w:type="dxa"/>
-            </w:tcMar>
-            <w:vAlign w:val="center"/>
-          </w:tcPr>
-          <w:p>
-            <w:pPr>
-              <w:spacing w:after="0"/>
-            </w:pPr>
-            <w:r/>
-            <w:r>
-              <w:rPr>
-                <w:rFonts w:ascii="Arial" w:hAnsi="Arial"/>
-                <w:b/>
-                <w:color w:val="FFFFFF"/>
-                <w:sz w:val="16"/>
-              </w:rPr>
-              <w:t>Contraseña de demostración</w:t>
-            </w:r>
-          </w:p>
-        </w:tc>
-      </w:tr>
-      <w:tr>
-        <w:tc>
-          <w:tcPr>
-            <w:tcW w:type="dxa" w:w="2160"/>
-            <w:vAlign w:val="center"/>
-            <w:shd w:fill="EFF5FA"/>
-            <w:tcMar>
-              <w:top w:w="95" w:type="dxa"/>
-              <w:start w:w="115" w:type="dxa"/>
-              <w:bottom w:w="95" w:type="dxa"/>
-              <w:end w:w="115" w:type="dxa"/>
-            </w:tcMar>
-          </w:tcPr>
-          <w:p>
-            <w:pPr>
-              <w:spacing w:after="0" w:line="240" w:lineRule="auto"/>
-            </w:pPr>
-            <w:r/>
-            <w:r>
-              <w:rPr>
-                <w:rFonts w:ascii="Arial" w:hAnsi="Arial"/>
-                <w:b/>
-                <w:color w:val="182B43"/>
-                <w:sz w:val="16"/>
-              </w:rPr>
-              <w:t>Administración</w:t>
-            </w:r>
-          </w:p>
-        </w:tc>
-        <w:tc>
-          <w:tcPr>
-            <w:tcW w:type="dxa" w:w="3888"/>
-            <w:vAlign w:val="center"/>
-            <w:shd w:fill="EFF5FA"/>
-            <w:tcMar>
-              <w:top w:w="95" w:type="dxa"/>
-              <w:start w:w="115" w:type="dxa"/>
-              <w:bottom w:w="95" w:type="dxa"/>
-              <w:end w:w="115" w:type="dxa"/>
-            </w:tcMar>
-          </w:tcPr>
-          <w:p>
-            <w:pPr>
-              <w:spacing w:after="0" w:line="240" w:lineRule="auto"/>
-            </w:pPr>
-            <w:r/>
-            <w:r>
-              <w:rPr>
-                <w:rFonts w:ascii="Arial" w:hAnsi="Arial"/>
-                <w:b w:val="0"/>
-                <w:color w:val="182B43"/>
-                <w:sz w:val="16"/>
-              </w:rPr>
-              <w:t>admin@nbu.test</w:t>
-            </w:r>
-          </w:p>
-        </w:tc>
-        <w:tc>
-          <w:tcPr>
-            <w:tcW w:type="dxa" w:w="4464"/>
-            <w:vAlign w:val="center"/>
-            <w:shd w:fill="EFF5FA"/>
-            <w:tcMar>
-              <w:top w:w="95" w:type="dxa"/>
-              <w:start w:w="115" w:type="dxa"/>
-              <w:bottom w:w="95" w:type="dxa"/>
-              <w:end w:w="115" w:type="dxa"/>
-            </w:tcMar>
-          </w:tcPr>
-          <w:p>
-            <w:pPr>
-              <w:spacing w:after="0" w:line="240" w:lineRule="auto"/>
-            </w:pPr>
-            <w:r/>
-            <w:r>
-              <w:rPr>
-                <w:rFonts w:ascii="Arial" w:hAnsi="Arial"/>
-                <w:b w:val="0"/>
-                <w:color w:val="182B43"/>
-                <w:sz w:val="16"/>
-              </w:rPr>
-              <w:t>NbuAdmin2026!</w:t>
-            </w:r>
-          </w:p>
-        </w:tc>
-      </w:tr>
-      <w:tr>
-        <w:tc>
-          <w:tcPr>
-            <w:tcW w:type="dxa" w:w="2160"/>
-            <w:vAlign w:val="center"/>
-            <w:shd w:fill="FFFFFF"/>
-            <w:tcMar>
-              <w:top w:w="95" w:type="dxa"/>
-              <w:start w:w="115" w:type="dxa"/>
-              <w:bottom w:w="95" w:type="dxa"/>
-              <w:end w:w="115" w:type="dxa"/>
-            </w:tcMar>
-          </w:tcPr>
-          <w:p>
-            <w:pPr>
-              <w:spacing w:after="0" w:line="240" w:lineRule="auto"/>
-            </w:pPr>
-            <w:r/>
-            <w:r>
-              <w:rPr>
-                <w:rFonts w:ascii="Arial" w:hAnsi="Arial"/>
-                <w:b/>
-                <w:color w:val="182B43"/>
-                <w:sz w:val="16"/>
-              </w:rPr>
-              <w:t>Estudiante</w:t>
-            </w:r>
-          </w:p>
-        </w:tc>
-        <w:tc>
-          <w:tcPr>
-            <w:tcW w:type="dxa" w:w="3888"/>
-            <w:vAlign w:val="center"/>
-            <w:shd w:fill="FFFFFF"/>
-            <w:tcMar>
-              <w:top w:w="95" w:type="dxa"/>
-              <w:start w:w="115" w:type="dxa"/>
-              <w:bottom w:w="95" w:type="dxa"/>
-              <w:end w:w="115" w:type="dxa"/>
-            </w:tcMar>
-          </w:tcPr>
-          <w:p>
-            <w:pPr>
-              <w:spacing w:after="0" w:line="240" w:lineRule="auto"/>
-            </w:pPr>
-            <w:r/>
-            <w:r>
-              <w:rPr>
-                <w:rFonts w:ascii="Arial" w:hAnsi="Arial"/>
-                <w:b w:val="0"/>
-                <w:color w:val="182B43"/>
-                <w:sz w:val="16"/>
-              </w:rPr>
-              <w:t>ana.mendez@example.test</w:t>
-            </w:r>
-          </w:p>
-        </w:tc>
-        <w:tc>
-          <w:tcPr>
-            <w:tcW w:type="dxa" w:w="4464"/>
-            <w:vAlign w:val="center"/>
-            <w:shd w:fill="FFFFFF"/>
-            <w:tcMar>
-              <w:top w:w="95" w:type="dxa"/>
-              <w:start w:w="115" w:type="dxa"/>
-              <w:bottom w:w="95" w:type="dxa"/>
-              <w:end w:w="115" w:type="dxa"/>
-            </w:tcMar>
-          </w:tcPr>
-          <w:p>
-            <w:pPr>
-              <w:spacing w:after="0" w:line="240" w:lineRule="auto"/>
-            </w:pPr>
-            <w:r/>
-            <w:r>
-              <w:rPr>
-                <w:rFonts w:ascii="Arial" w:hAnsi="Arial"/>
-                <w:b w:val="0"/>
-                <w:color w:val="182B43"/>
-                <w:sz w:val="16"/>
-              </w:rPr>
-              <w:t>NbuEstudiante2026!</w:t>
-            </w:r>
-          </w:p>
-        </w:tc>
-      </w:tr>
-    </w:tbl>
-    <w:p>
-      <w:pPr>
-        <w:spacing w:after="0"/>
-      </w:pPr>
     </w:p>
     <w:p>
       <w:pPr>
@@ -2561,84 +2926,228 @@
       <w:r>
         <w:rPr>
           <w:rFonts w:ascii="Arial" w:hAnsi="Arial"/>
-          <w:color w:val="8B5B16"/>
+          <w:b w:val="0"/>
+          <w:color w:val="182B43"/>
+          <w:sz w:val="18"/>
         </w:rPr>
-        <w:t>El seeder solo se ejecuta en Desarrollo. Los nombres, correos, teléfonos y pagos de ejemplo son ficticios. Cambiar las contraseñas iniciales antes de cualquier uso fuera del entorno local.</w:t>
+        <w:t>Desde PowerShell, abre la raíz del repositorio. Para el sitio en la misma computadora:</w:t>
+      </w:r>
+    </w:p>
+    <w:tbl>
+      <w:tblPr>
+        <w:tblStyle w:val="TableGrid"/>
+        <w:tblW w:type="auto" w:w="0"/>
+        <w:tblLook w:firstColumn="1" w:firstRow="1" w:lastColumn="0" w:lastRow="0" w:noHBand="0" w:noVBand="1" w:val="04A0"/>
+      </w:tblPr>
+      <w:tblGrid>
+        <w:gridCol w:w="9893"/>
+      </w:tblGrid>
+      <w:tr>
+        <w:tc>
+          <w:tcPr>
+            <w:tcW w:type="dxa" w:w="9893"/>
+            <w:vAlign w:val="center"/>
+            <w:shd w:fill="F3F6F8"/>
+            <w:tcMar>
+              <w:top w:w="80" w:type="dxa"/>
+              <w:start w:w="100" w:type="dxa"/>
+              <w:bottom w:w="80" w:type="dxa"/>
+              <w:end w:w="100" w:type="dxa"/>
+            </w:tcMar>
+          </w:tcPr>
+          <w:p>
+            <w:pPr>
+              <w:spacing w:after="0" w:line="245" w:lineRule="auto"/>
+            </w:pPr>
+            <w:r>
+              <w:rPr>
+                <w:rFonts w:ascii="Consolas" w:hAnsi="Consolas"/>
+              </w:rPr>
+            </w:r>
+            <w:r>
+              <w:rPr>
+                <w:rFonts w:ascii="Consolas" w:hAnsi="Consolas"/>
+                <w:b w:val="0"/>
+                <w:color w:val="182B43"/>
+                <w:sz w:val="16"/>
+              </w:rPr>
+              <w:t>dotnet run --project .\NBU.Web\NBU.Web.csproj --urls http://localhost:5221</w:t>
+            </w:r>
+          </w:p>
+        </w:tc>
+      </w:tr>
+    </w:tbl>
+    <w:p>
+      <w:pPr>
+        <w:widowControl/>
+      </w:pPr>
+      <w:r>
+        <w:rPr>
+          <w:rFonts w:ascii="Arial" w:hAnsi="Arial"/>
+          <w:b w:val="0"/>
+          <w:color w:val="182B43"/>
+          <w:sz w:val="18"/>
+        </w:rPr>
+        <w:t>Después abre http://localhost:5221 en el navegador. Para el programa de escritorio:</w:t>
+      </w:r>
+    </w:p>
+    <w:tbl>
+      <w:tblPr>
+        <w:tblStyle w:val="TableGrid"/>
+        <w:tblW w:type="auto" w:w="0"/>
+        <w:tblLook w:firstColumn="1" w:firstRow="1" w:lastColumn="0" w:lastRow="0" w:noHBand="0" w:noVBand="1" w:val="04A0"/>
+      </w:tblPr>
+      <w:tblGrid>
+        <w:gridCol w:w="9893"/>
+      </w:tblGrid>
+      <w:tr>
+        <w:tc>
+          <w:tcPr>
+            <w:tcW w:type="dxa" w:w="9893"/>
+            <w:vAlign w:val="center"/>
+            <w:shd w:fill="F3F6F8"/>
+            <w:tcMar>
+              <w:top w:w="80" w:type="dxa"/>
+              <w:start w:w="100" w:type="dxa"/>
+              <w:bottom w:w="80" w:type="dxa"/>
+              <w:end w:w="100" w:type="dxa"/>
+            </w:tcMar>
+          </w:tcPr>
+          <w:p>
+            <w:pPr>
+              <w:spacing w:after="0" w:line="245" w:lineRule="auto"/>
+            </w:pPr>
+            <w:r>
+              <w:rPr>
+                <w:rFonts w:ascii="Consolas" w:hAnsi="Consolas"/>
+              </w:rPr>
+            </w:r>
+            <w:r>
+              <w:rPr>
+                <w:rFonts w:ascii="Consolas" w:hAnsi="Consolas"/>
+                <w:b w:val="0"/>
+                <w:color w:val="182B43"/>
+                <w:sz w:val="16"/>
+              </w:rPr>
+              <w:t>.\entregables\escritorio\NBU.Desktop.exe</w:t>
+            </w:r>
+          </w:p>
+        </w:tc>
+      </w:tr>
+    </w:tbl>
+    <w:p>
+      <w:pPr>
+        <w:widowControl/>
+      </w:pPr>
+      <w:r>
+        <w:rPr>
+          <w:rFonts w:ascii="Arial" w:hAnsi="Arial"/>
+          <w:b w:val="0"/>
+          <w:color w:val="805B18"/>
+          <w:sz w:val="17"/>
+        </w:rPr>
+        <w:t>Las cuentas admin@nbu.test y ana.mendez@example.test son cuentas ficticias de demostración creadas en Development; sus claves aparecen solo en README.md y no deben usarse en un sitio público.</w:t>
       </w:r>
     </w:p>
     <w:p>
       <w:pPr>
-        <w:pStyle w:val="Heading1"/>
+        <w:pStyle w:val="Heading2"/>
       </w:pPr>
       <w:r>
-        <w:t>8. Configuración y mantenimiento</w:t>
+        <w:t>10. Demostración de integración</w:t>
       </w:r>
     </w:p>
     <w:p>
       <w:pPr>
-        <w:pStyle w:val="ListBullet"/>
-        <w:spacing w:after="60"/>
-        <w:ind w:left="317" w:hanging="173"/>
+        <w:widowControl/>
+        <w:spacing w:after="40"/>
+        <w:ind w:left="403" w:hanging="317"/>
       </w:pPr>
       <w:r>
         <w:rPr>
           <w:rFonts w:ascii="Arial" w:hAnsi="Arial"/>
+          <w:b w:val="0"/>
           <w:color w:val="182B43"/>
-          <w:sz w:val="19"/>
+          <w:sz w:val="18"/>
         </w:rPr>
-        <w:t>El portal aplica automáticamente las migraciones de EF Core en Development. En un entorno distinto, revisar y aplicar el script SQL de forma controlada.</w:t>
+        <w:t>1. Inicia SQL Server y deja abierta la aplicación web y Windows Forms.</w:t>
       </w:r>
     </w:p>
     <w:p>
       <w:pPr>
-        <w:pStyle w:val="ListBullet"/>
-        <w:spacing w:after="60"/>
-        <w:ind w:left="317" w:hanging="173"/>
+        <w:widowControl/>
+        <w:spacing w:after="40"/>
+        <w:ind w:left="403" w:hanging="317"/>
       </w:pPr>
       <w:r>
         <w:rPr>
           <w:rFonts w:ascii="Arial" w:hAnsi="Arial"/>
+          <w:b w:val="0"/>
           <w:color w:val="182B43"/>
-          <w:sz w:val="19"/>
+          <w:sz w:val="18"/>
         </w:rPr>
-        <w:t>No guardar credenciales reales ni datos personales en el repositorio Git.</w:t>
+        <w:t>2. Agrega o edita un registro permitido en una aplicación y guarda.</w:t>
       </w:r>
     </w:p>
     <w:p>
       <w:pPr>
-        <w:pStyle w:val="ListBullet"/>
-        <w:spacing w:after="60"/>
-        <w:ind w:left="317" w:hanging="173"/>
+        <w:widowControl/>
+        <w:spacing w:after="40"/>
+        <w:ind w:left="403" w:hanging="317"/>
       </w:pPr>
       <w:r>
         <w:rPr>
           <w:rFonts w:ascii="Arial" w:hAnsi="Arial"/>
+          <w:b w:val="0"/>
           <w:color w:val="182B43"/>
-          <w:sz w:val="19"/>
+          <w:sz w:val="18"/>
         </w:rPr>
-        <w:t>El ejecutable de escritorio utiliza la misma base y requiere que SQL Server esté iniciado.</w:t>
+        <w:t>3. Actualiza la consulta en la otra aplicación y confirma el mismo cambio.</w:t>
       </w:r>
     </w:p>
     <w:p>
       <w:pPr>
-        <w:pStyle w:val="ListBullet"/>
-        <w:spacing w:after="60"/>
-        <w:ind w:left="317" w:hanging="173"/>
+        <w:widowControl/>
+        <w:spacing w:after="40"/>
+        <w:ind w:left="403" w:hanging="317"/>
       </w:pPr>
       <w:r>
         <w:rPr>
           <w:rFonts w:ascii="Arial" w:hAnsi="Arial"/>
+          <w:b w:val="0"/>
           <w:color w:val="182B43"/>
-          <w:sz w:val="19"/>
+          <w:sz w:val="18"/>
         </w:rPr>
-        <w:t>No distribuir la base con datos reales de estudiantes como parte de una demostración pública.</w:t>
+        <w:t>4. Explica que ambas cadenas usan la base NBU y que NBU.Data comparte las entidades y el AppDbContext.</w:t>
+      </w:r>
+    </w:p>
+    <w:p>
+      <w:pPr>
+        <w:pStyle w:val="Heading2"/>
+      </w:pPr>
+      <w:r>
+        <w:t>Acceso desde celulares en la misma red</w:t>
+      </w:r>
+    </w:p>
+    <w:p>
+      <w:pPr>
+        <w:widowControl/>
+      </w:pPr>
+      <w:r>
+        <w:rPr>
+          <w:rFonts w:ascii="Arial" w:hAnsi="Arial"/>
+          <w:b w:val="0"/>
+          <w:color w:val="182B43"/>
+          <w:sz w:val="18"/>
+        </w:rPr>
+        <w:t>El servidor web debe estar encendido y los teléfonos conectados al mismo Wi-Fi que la computadora. Ejecuta la web escuchando en la red local con --urls http://0.0.0.0:5221; consulta ipconfig y abre http://DIRECCION-IPv4:5221 desde cada teléfono. localhost solo abre el propio dispositivo. El proyecto no está publicado en internet.</w:t>
       </w:r>
     </w:p>
     <w:sectPr>
       <w:headerReference w:type="default" r:id="rId9"/>
       <w:footerReference w:type="default" r:id="rId10"/>
-      <w:pgSz w:w="12240" w:h="15840"/>
-      <w:pgMar w:top="936" w:right="1037" w:bottom="893" w:left="1037" w:header="403" w:footer="403" w:gutter="0"/>
+      <w:pgSz w:w="11909" w:h="16834"/>
+      <w:pgMar w:top="979" w:right="1008" w:bottom="922" w:left="1008" w:header="432" w:footer="432" w:gutter="0"/>
       <w:cols w:space="720"/>
       <w:docGrid w:linePitch="360"/>
     </w:sectPr>
@@ -2656,6 +3165,7 @@
     <w:r>
       <w:rPr>
         <w:rFonts w:ascii="Arial" w:hAnsi="Arial"/>
+        <w:b w:val="0"/>
         <w:color w:val="64758A"/>
         <w:sz w:val="16"/>
       </w:rPr>
@@ -2664,6 +3174,7 @@
     <w:r>
       <w:rPr>
         <w:rFonts w:ascii="Arial" w:hAnsi="Arial"/>
+        <w:b w:val="0"/>
         <w:color w:val="64758A"/>
         <w:sz w:val="16"/>
       </w:rPr>
@@ -2691,7 +3202,7 @@
         <w:color w:val="092754"/>
         <w:sz w:val="16"/>
       </w:rPr>
-      <w:t>NBU  |  NICARAGUA BECAS UNIVERSITARIAS</w:t>
+      <w:t>NBU  ·  NICARAGUA BECAS UNIVERSITARIAS</w:t>
     </w:r>
   </w:p>
 </w:hdr>
@@ -3061,12 +3572,12 @@
     <w:qFormat/>
     <w:rsid w:val="00FC693F"/>
     <w:pPr>
-      <w:spacing w:after="100" w:line="259" w:lineRule="auto"/>
+      <w:spacing w:after="80" w:line="259" w:lineRule="auto"/>
     </w:pPr>
     <w:rPr>
       <w:rFonts w:ascii="Arial" w:hAnsi="Arial"/>
       <w:color w:val="182B43"/>
-      <w:sz w:val="20"/>
+      <w:sz w:val="18"/>
     </w:rPr>
   </w:style>
   <w:style w:type="paragraph" w:styleId="Header">
@@ -3124,7 +3635,7 @@
     <w:pPr>
       <w:keepNext/>
       <w:keepLines/>
-      <w:spacing w:before="200" w:after="100"/>
+      <w:spacing w:before="160" w:after="80"/>
       <w:outlineLvl w:val="0"/>
     </w:pPr>
     <w:rPr>
@@ -3132,7 +3643,7 @@
       <w:b/>
       <w:bCs/>
       <w:color w:val="092754"/>
-      <w:sz w:val="32"/>
+      <w:sz w:val="31"/>
       <w:szCs w:val="28"/>
     </w:rPr>
   </w:style>
@@ -3148,15 +3659,15 @@
     <w:pPr>
       <w:keepNext/>
       <w:keepLines/>
-      <w:spacing w:before="200" w:after="100"/>
+      <w:spacing w:before="160" w:after="80"/>
       <w:outlineLvl w:val="1"/>
     </w:pPr>
     <w:rPr>
       <w:rFonts w:asciiTheme="majorHAnsi" w:eastAsiaTheme="majorEastAsia" w:hAnsiTheme="majorHAnsi" w:cstheme="majorBidi" w:ascii="Arial" w:hAnsi="Arial"/>
       <w:b/>
       <w:bCs/>
-      <w:color w:val="092754"/>
-      <w:sz w:val="23"/>
+      <w:color w:val="1267AD"/>
+      <w:sz w:val="22"/>
       <w:szCs w:val="26"/>
     </w:rPr>
   </w:style>
@@ -3411,13 +3922,16 @@
     <w:rsid w:val="00FC693F"/>
     <w:pPr>
       <w:keepNext/>
-      <w:spacing w:after="100" w:line="240" w:lineRule="auto" w:before="0"/>
+      <w:pBdr>
+        <w:bottom w:val="single" w:sz="8" w:space="4" w:color="4F81BD" w:themeColor="accent1"/>
+      </w:pBdr>
+      <w:spacing w:after="80" w:line="240" w:lineRule="auto" w:before="0"/>
       <w:contextualSpacing/>
     </w:pPr>
     <w:rPr>
       <w:rFonts w:asciiTheme="majorHAnsi" w:eastAsiaTheme="majorEastAsia" w:hAnsiTheme="majorHAnsi" w:cstheme="majorBidi" w:ascii="Arial" w:hAnsi="Arial"/>
       <w:b/>
-      <w:color w:val="000000"/>
+      <w:color w:val="092754"/>
       <w:spacing w:val="5"/>
       <w:kern w:val="28"/>
       <w:sz w:val="50"/>

</xml_diff>